<commit_message>
Replace all U&S details with official SR TRANSPORT profile across templates and web preview
</commit_message>
<xml_diff>
--- a/11048.docx
+++ b/11048.docx
@@ -1,6 +1,6 @@
 
 <file path=word/document.xml><?xml version="1.0" encoding="utf-8"?>
-<w:document xmlns:wpc="http://schemas.microsoft.com/office/word/2010/wordprocessingCanvas" xmlns:cx="http://schemas.microsoft.com/office/drawing/2014/chartex" xmlns:cx1="http://schemas.microsoft.com/office/drawing/2015/9/8/chartex" xmlns:cx2="http://schemas.microsoft.com/office/drawing/2015/10/21/chartex" xmlns:cx3="http://schemas.microsoft.com/office/drawing/2016/5/9/chartex" xmlns:cx4="http://schemas.microsoft.com/office/drawing/2016/5/10/chartex" xmlns:cx5="http://schemas.microsoft.com/office/drawing/2016/5/11/chartex" xmlns:cx6="http://schemas.microsoft.com/office/drawing/2016/5/12/chartex" xmlns:cx7="http://schemas.microsoft.com/office/drawing/2016/5/13/chartex" xmlns:cx8="http://schemas.microsoft.com/office/drawing/2016/5/14/chartex" xmlns:mc="http://schemas.openxmlformats.org/markup-compatibility/2006" xmlns:aink="http://schemas.microsoft.com/office/drawing/2016/ink" xmlns:am3d="http://schemas.microsoft.com/office/drawing/2017/model3d" xmlns:o="urn:schemas-microsoft-com:office:office" xmlns:oel="http://schemas.microsoft.com/office/2019/extlst" xmlns:r="http://schemas.openxmlformats.org/officeDocument/2006/relationships" xmlns:m="http://schemas.openxmlformats.org/officeDocument/2006/math" xmlns:v="urn:schemas-microsoft-com:vml" xmlns:wp14="http://schemas.microsoft.com/office/word/2010/wordprocessingDrawing" xmlns:wp="http://schemas.openxmlformats.org/drawingml/2006/wordprocessingDrawing" xmlns:w10="urn:schemas-microsoft-com:office:word" xmlns:w="http://schemas.openxmlformats.org/wordprocessingml/2006/main" xmlns:w14="http://schemas.microsoft.com/office/word/2010/wordml" xmlns:w15="http://schemas.microsoft.com/office/word/2012/wordml" xmlns:w16cex="http://schemas.microsoft.com/office/word/2018/wordml/cex" xmlns:w16cid="http://schemas.microsoft.com/office/word/2016/wordml/cid" xmlns:w16="http://schemas.microsoft.com/office/word/2018/wordml" xmlns:w16du="http://schemas.microsoft.com/office/word/2023/wordml/word16du" xmlns:w16sdtdh="http://schemas.microsoft.com/office/word/2020/wordml/sdtdatahash" xmlns:w16sdtfl="http://schemas.microsoft.com/office/word/2024/wordml/sdtformatlock" xmlns:w16se="http://schemas.microsoft.com/office/word/2015/wordml/symex" xmlns:wpg="http://schemas.microsoft.com/office/word/2010/wordprocessingGroup" xmlns:wpi="http://schemas.microsoft.com/office/word/2010/wordprocessingInk" xmlns:wne="http://schemas.microsoft.com/office/word/2006/wordml" xmlns:wps="http://schemas.microsoft.com/office/word/2010/wordprocessingShape" mc:Ignorable="w14 w15 w16se w16cid w16 w16cex w16sdtdh w16sdtfl w16du wp14">
+<w:document xmlns:a="http://schemas.openxmlformats.org/drawingml/2006/main" xmlns:mc="http://schemas.openxmlformats.org/markup-compatibility/2006" xmlns:ns10="urn:schemas-microsoft-com:office:office" xmlns:ns11="http://schemas.microsoft.com/office/word/2010/wordprocessingShape" xmlns:ns12="urn:schemas-microsoft-com:office:word" xmlns:ns4="http://schemas.microsoft.com/office/word/2010/wordprocessingDrawing" xmlns:pic="http://schemas.openxmlformats.org/drawingml/2006/picture" xmlns:r="http://schemas.openxmlformats.org/officeDocument/2006/relationships" xmlns:v="urn:schemas-microsoft-com:vml" xmlns:w="http://schemas.openxmlformats.org/wordprocessingml/2006/main" xmlns:w14="http://schemas.microsoft.com/office/word/2010/wordml" xmlns:wp="http://schemas.openxmlformats.org/drawingml/2006/wordprocessingDrawing" xmlns:wpg="http://schemas.microsoft.com/office/word/2010/wordprocessingGroup" mc:Ignorable="w14 w15 w16se w16cid w16 w16cex w16sdtdh w16sdtfl w16du wp14">
   <w:body>
     <w:tbl>
       <w:tblPr>
@@ -112,7 +112,7 @@
               <mc:AlternateContent>
                 <mc:Choice Requires="wpg">
                   <w:drawing>
-                    <wp:anchor distT="0" distB="0" distL="0" distR="0" simplePos="0" relativeHeight="487419904" behindDoc="1" locked="0" layoutInCell="1" allowOverlap="1" wp14:anchorId="43ED93BA" wp14:editId="0C4919D2">
+                    <wp:anchor distT="0" distB="0" distL="0" distR="0" simplePos="0" relativeHeight="487419904" behindDoc="1" locked="0" layoutInCell="1" allowOverlap="1" ns4:anchorId="43ED93BA" ns4:editId="0C4919D2">
                       <wp:simplePos x="0" y="0"/>
                       <wp:positionH relativeFrom="column">
                         <wp:posOffset>1671827</wp:posOffset>
@@ -125,9 +125,9 @@
                       <wp:wrapNone/>
                       <wp:docPr id="1" name="Group 1"/>
                       <wp:cNvGraphicFramePr>
-                        <a:graphicFrameLocks xmlns:a="http://schemas.openxmlformats.org/drawingml/2006/main"/>
+                        <a:graphicFrameLocks/>
                       </wp:cNvGraphicFramePr>
-                      <a:graphic xmlns:a="http://schemas.openxmlformats.org/drawingml/2006/main">
+                      <a:graphic>
                         <a:graphicData uri="http://schemas.microsoft.com/office/word/2010/wordprocessingGroup">
                           <wpg:wgp>
                             <wpg:cNvGrpSpPr>
@@ -141,7 +141,7 @@
                                 <a:chExt cx="1320165" cy="771525"/>
                               </a:xfrm>
                             </wpg:grpSpPr>
-                            <pic:pic xmlns:pic="http://schemas.openxmlformats.org/drawingml/2006/picture">
+                            <pic:pic>
                               <pic:nvPicPr>
                                 <pic:cNvPr id="2" name="Image 2"/>
                                 <pic:cNvPicPr/>
@@ -170,8 +170,8 @@
                 </mc:Choice>
                 <mc:Fallback>
                   <w:pict>
-                    <v:group w14:anchorId="3274F24C" id="Group 1" o:spid="_x0000_s1026" style="position:absolute;margin-left:131.65pt;margin-top:11.8pt;width:103.95pt;height:60.75pt;z-index:-15896576;mso-wrap-distance-left:0;mso-wrap-distance-right:0" coordsize="13201,7715" o:gfxdata="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">
-                      <v:shapetype id="_x0000_t75" coordsize="21600,21600" o:spt="75" o:preferrelative="t" path="m@4@5l@4@11@9@11@9@5xe" filled="f" stroked="f">
+                    <v:group w14:anchorId="3274F24C" id="Group 1" ns10:spid="_x0000_s1026" style="position:absolute;margin-left:131.65pt;margin-top:11.8pt;width:103.95pt;height:60.75pt;z-index:-15896576;mso-wrap-distance-left:0;mso-wrap-distance-right:0" coordsize="13201,7715" ns10:gfxdata="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">
+                      <v:shapetype id="_x0000_t75" coordsize="21600,21600" ns10:spt="75" ns10:preferrelative="t" path="m@4@5l@4@11@9@11@9@5xe" filled="f" stroked="f">
                         <v:stroke joinstyle="miter"/>
                         <v:formulas>
                           <v:f eqn="if lineDrawn pixelLineWidth 0"/>
@@ -187,11 +187,11 @@
                           <v:f eqn="prod @7 21600 pixelHeight"/>
                           <v:f eqn="sum @10 21600 0"/>
                         </v:formulas>
-                        <v:path o:extrusionok="f" gradientshapeok="t" o:connecttype="rect"/>
-                        <o:lock v:ext="edit" aspectratio="t"/>
+                        <v:path ns10:extrusionok="f" gradientshapeok="t" ns10:connecttype="rect"/>
+                        <ns10:lock v:ext="edit" aspectratio="t"/>
                       </v:shapetype>
-                      <v:shape id="Image 2" o:spid="_x0000_s1027" type="#_x0000_t75" style="position:absolute;width:13146;height:7680;visibility:visible;mso-wrap-style:square" o:gfxdata="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">
-                        <v:imagedata r:id="rId5" o:title=""/>
+                      <v:shape id="Image 2" ns10:spid="_x0000_s1027" type="#_x0000_t75" style="position:absolute;width:13146;height:7680;visibility:visible;mso-wrap-style:square" ns10:gfxdata="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">
+                        <v:imagedata r:id="rId5" ns10:title=""/>
                       </v:shape>
                     </v:group>
                   </w:pict>
@@ -204,7 +204,7 @@
                 <w:b/>
                 <w:sz w:val="28"/>
               </w:rPr>
-              <w:t>U&amp;S</w:t>
+              <w:t>SR TRANSPORT</w:t>
             </w:r>
             <w:r>
               <w:rPr>
@@ -213,7 +213,7 @@
                 <w:spacing w:val="-10"/>
                 <w:sz w:val="28"/>
               </w:rPr>
-              <w:t xml:space="preserve"> </w:t>
+              <w:t xml:space="preserve"/>
             </w:r>
             <w:r>
               <w:rPr>
@@ -221,7 +221,7 @@
                 <w:b/>
                 <w:sz w:val="28"/>
               </w:rPr>
-              <w:t>Trans</w:t>
+              <w:t/>
             </w:r>
             <w:r>
               <w:rPr>
@@ -230,7 +230,7 @@
                 <w:spacing w:val="-9"/>
                 <w:sz w:val="28"/>
               </w:rPr>
-              <w:t xml:space="preserve"> </w:t>
+              <w:t xml:space="preserve"/>
             </w:r>
             <w:r>
               <w:rPr>
@@ -238,7 +238,7 @@
                 <w:b/>
                 <w:sz w:val="28"/>
               </w:rPr>
-              <w:t>and</w:t>
+              <w:t/>
             </w:r>
             <w:r>
               <w:rPr>
@@ -247,7 +247,7 @@
                 <w:spacing w:val="-9"/>
                 <w:sz w:val="28"/>
               </w:rPr>
-              <w:t xml:space="preserve"> </w:t>
+              <w:t xml:space="preserve"/>
             </w:r>
             <w:r>
               <w:rPr>
@@ -255,7 +255,7 @@
                 <w:b/>
                 <w:sz w:val="28"/>
               </w:rPr>
-              <w:t>Trade</w:t>
+              <w:t/>
             </w:r>
             <w:r>
               <w:rPr>
@@ -264,7 +264,7 @@
                 <w:spacing w:val="-8"/>
                 <w:sz w:val="28"/>
               </w:rPr>
-              <w:t xml:space="preserve"> </w:t>
+              <w:t xml:space="preserve"/>
             </w:r>
             <w:r>
               <w:rPr>
@@ -272,7 +272,7 @@
                 <w:b/>
                 <w:sz w:val="28"/>
               </w:rPr>
-              <w:t>India</w:t>
+              <w:t/>
             </w:r>
             <w:r>
               <w:rPr>
@@ -281,7 +281,7 @@
                 <w:spacing w:val="-9"/>
                 <w:sz w:val="28"/>
               </w:rPr>
-              <w:t xml:space="preserve"> </w:t>
+              <w:t xml:space="preserve"/>
             </w:r>
             <w:r>
               <w:rPr>
@@ -289,7 +289,7 @@
                 <w:b/>
                 <w:sz w:val="28"/>
               </w:rPr>
-              <w:t>Private</w:t>
+              <w:t/>
             </w:r>
             <w:r>
               <w:rPr>
@@ -298,7 +298,7 @@
                 <w:spacing w:val="-7"/>
                 <w:sz w:val="28"/>
               </w:rPr>
-              <w:t xml:space="preserve"> </w:t>
+              <w:t xml:space="preserve"/>
             </w:r>
             <w:r>
               <w:rPr>
@@ -307,7 +307,7 @@
                 <w:spacing w:val="-2"/>
                 <w:sz w:val="28"/>
               </w:rPr>
-              <w:t>Limited</w:t>
+              <w:t/>
             </w:r>
           </w:p>
           <w:p>
@@ -323,85 +323,85 @@
               <w:rPr>
                 <w:sz w:val="20"/>
               </w:rPr>
-              <w:t>1-2-597/36</w:t>
+              <w:t>Plot No. 341, Sai Bhagavan Colony, Beeramguda, R.C. Puram, Hyderabad - 502032</w:t>
             </w:r>
             <w:r>
               <w:rPr>
                 <w:spacing w:val="-10"/>
                 <w:sz w:val="20"/>
               </w:rPr>
-              <w:t xml:space="preserve"> </w:t>
-            </w:r>
-            <w:r>
-              <w:rPr>
-                <w:sz w:val="20"/>
-              </w:rPr>
-              <w:t>to</w:t>
+              <w:t xml:space="preserve"/>
+            </w:r>
+            <w:r>
+              <w:rPr>
+                <w:sz w:val="20"/>
+              </w:rPr>
+              <w:t/>
             </w:r>
             <w:r>
               <w:rPr>
                 <w:spacing w:val="-9"/>
                 <w:sz w:val="20"/>
               </w:rPr>
-              <w:t xml:space="preserve"> </w:t>
-            </w:r>
-            <w:r>
-              <w:rPr>
-                <w:sz w:val="20"/>
-              </w:rPr>
-              <w:t>41,</w:t>
+              <w:t xml:space="preserve"/>
+            </w:r>
+            <w:r>
+              <w:rPr>
+                <w:sz w:val="20"/>
+              </w:rPr>
+              <w:t/>
             </w:r>
             <w:r>
               <w:rPr>
                 <w:spacing w:val="-9"/>
                 <w:sz w:val="20"/>
               </w:rPr>
-              <w:t xml:space="preserve"> </w:t>
-            </w:r>
-            <w:r>
-              <w:rPr>
-                <w:sz w:val="20"/>
-              </w:rPr>
-              <w:t>SVSS</w:t>
+              <w:t xml:space="preserve"/>
+            </w:r>
+            <w:r>
+              <w:rPr>
+                <w:sz w:val="20"/>
+              </w:rPr>
+              <w:t/>
             </w:r>
             <w:r>
               <w:rPr>
                 <w:spacing w:val="-10"/>
                 <w:sz w:val="20"/>
               </w:rPr>
-              <w:t xml:space="preserve"> </w:t>
-            </w:r>
-            <w:r>
-              <w:rPr>
-                <w:sz w:val="20"/>
-              </w:rPr>
-              <w:t>SANKALP</w:t>
+              <w:t xml:space="preserve"/>
+            </w:r>
+            <w:r>
+              <w:rPr>
+                <w:sz w:val="20"/>
+              </w:rPr>
+              <w:t/>
             </w:r>
             <w:r>
               <w:rPr>
                 <w:spacing w:val="-9"/>
                 <w:sz w:val="20"/>
               </w:rPr>
-              <w:t xml:space="preserve"> </w:t>
-            </w:r>
-            <w:r>
-              <w:rPr>
-                <w:sz w:val="20"/>
-              </w:rPr>
-              <w:t>Apts,</w:t>
+              <w:t xml:space="preserve"/>
+            </w:r>
+            <w:r>
+              <w:rPr>
+                <w:sz w:val="20"/>
+              </w:rPr>
+              <w:t/>
             </w:r>
             <w:r>
               <w:rPr>
                 <w:spacing w:val="-9"/>
                 <w:sz w:val="20"/>
               </w:rPr>
-              <w:t xml:space="preserve"> </w:t>
-            </w:r>
-            <w:r>
-              <w:rPr>
-                <w:sz w:val="20"/>
-              </w:rPr>
-              <w:t>C-303 LOWER TANK BUND, HYDERABAD-500 080</w:t>
+              <w:t xml:space="preserve"/>
+            </w:r>
+            <w:r>
+              <w:rPr>
+                <w:sz w:val="20"/>
+              </w:rPr>
+              <w:t/>
             </w:r>
           </w:p>
           <w:p>
@@ -450,21 +450,21 @@
               <w:rPr>
                 <w:sz w:val="20"/>
               </w:rPr>
-              <w:t>+91</w:t>
+              <w:t/>
             </w:r>
             <w:r>
               <w:rPr>
                 <w:spacing w:val="-4"/>
                 <w:sz w:val="20"/>
               </w:rPr>
-              <w:t xml:space="preserve"> </w:t>
+              <w:t xml:space="preserve"/>
             </w:r>
             <w:r>
               <w:rPr>
                 <w:spacing w:val="-2"/>
                 <w:sz w:val="20"/>
               </w:rPr>
-              <w:t>9704527762</w:t>
+              <w:t> 9704527762 / 9010578128 / 9966818478</w:t>
             </w:r>
             <w:r>
               <w:rPr>
@@ -493,7 +493,7 @@
                   <w:spacing w:val="-2"/>
                   <w:sz w:val="20"/>
                 </w:rPr>
-                <w:t>ustpl12@gmail.com</w:t>
+                <w:t>rudrajagan.b@gmail.com</w:t>
               </w:r>
             </w:hyperlink>
           </w:p>
@@ -546,7 +546,7 @@
               <w:rPr>
                 <w:b/>
               </w:rPr>
-              <w:t>AskInput</w:t>
+              <w:t>{{customer_name}}</w:t>
             </w:r>
             <w:r>
               <w:rPr>
@@ -576,7 +576,7 @@
                 <w:spacing w:val="-2"/>
                 <w:sz w:val="20"/>
               </w:rPr>
-              <w:t>askinput</w:t>
+              <w:t>{{gstin}}</w:t>
             </w:r>
           </w:p>
           <w:p>
@@ -596,7 +596,7 @@
               <w:rPr>
                 <w:sz w:val="20"/>
               </w:rPr>
-              <w:t>Ask Address input</w:t>
+              <w:t>{{customer_address_1}}</w:t>
             </w:r>
             <w:r>
               <w:rPr>
@@ -625,7 +625,7 @@
                 <w:spacing w:val="-2"/>
                 <w:sz w:val="20"/>
               </w:rPr>
-              <w:t>ask input</w:t>
+              <w:t>{{customer_state}}</w:t>
             </w:r>
           </w:p>
         </w:tc>
@@ -695,7 +695,7 @@
               <w:rPr>
                 <w:b/>
               </w:rPr>
-              <w:t>AskInput</w:t>
+              <w:t>{{invoice_number}}</w:t>
             </w:r>
           </w:p>
         </w:tc>
@@ -775,7 +775,7 @@
               <w:rPr>
                 <w:b/>
               </w:rPr>
-              <w:t>AskInput</w:t>
+              <w:t>{{invoice_date}}</w:t>
             </w:r>
           </w:p>
         </w:tc>
@@ -809,7 +809,7 @@
               <w:rPr>
                 <w:sz w:val="20"/>
               </w:rPr>
-              <w:t>ask</w:t>
+              <w:t>{{customer_address_2}}</w:t>
             </w:r>
             <w:r>
               <w:rPr>
@@ -855,7 +855,7 @@
                 <w:spacing w:val="-2"/>
                 <w:sz w:val="20"/>
               </w:rPr>
-              <w:t>09/UP</w:t>
+              <w:t>{{customer_state_code}}</w:t>
             </w:r>
           </w:p>
           <w:p>
@@ -912,7 +912,7 @@
               <w:rPr>
                 <w:b/>
               </w:rPr>
-              <w:t>AskInput</w:t>
+              <w:t>{{consignor}}</w:t>
             </w:r>
             <w:r>
               <w:rPr>
@@ -939,47 +939,41 @@
               <w:rPr>
                 <w:sz w:val="20"/>
               </w:rPr>
-              <w:t>GREEN</w:t>
+              <w:t>{{consignee}}</w:t>
             </w:r>
             <w:r>
               <w:rPr>
                 <w:spacing w:val="-12"/>
                 <w:sz w:val="20"/>
               </w:rPr>
-              <w:t xml:space="preserve"> </w:t>
-            </w:r>
-            <w:r>
-              <w:rPr>
-                <w:sz w:val="20"/>
-              </w:rPr>
-              <w:t>AGREVOLUTION</w:t>
+            </w:r>
+            <w:r>
+              <w:rPr>
+                <w:sz w:val="20"/>
+              </w:rPr>
             </w:r>
             <w:r>
               <w:rPr>
                 <w:spacing w:val="-11"/>
                 <w:sz w:val="20"/>
               </w:rPr>
-              <w:t xml:space="preserve"> </w:t>
-            </w:r>
-            <w:r>
-              <w:rPr>
-                <w:sz w:val="20"/>
-              </w:rPr>
-              <w:t>PVT</w:t>
+            </w:r>
+            <w:r>
+              <w:rPr>
+                <w:sz w:val="20"/>
+              </w:rPr>
             </w:r>
             <w:r>
               <w:rPr>
                 <w:spacing w:val="-11"/>
                 <w:sz w:val="20"/>
               </w:rPr>
-              <w:t xml:space="preserve"> </w:t>
             </w:r>
             <w:r>
               <w:rPr>
                 <w:spacing w:val="-5"/>
                 <w:sz w:val="20"/>
               </w:rPr>
-              <w:t>LTD</w:t>
             </w:r>
           </w:p>
           <w:p>
@@ -1016,7 +1010,7 @@
               <w:rPr>
                 <w:b/>
               </w:rPr>
-              <w:t>AskInput</w:t>
+              <w:t>{{consignor_address}}</w:t>
             </w:r>
             <w:r>
               <w:rPr>
@@ -1043,7 +1037,7 @@
               <w:rPr>
                 <w:b/>
               </w:rPr>
-              <w:t>AskInput</w:t>
+              <w:t>{{consignee_address}}</w:t>
             </w:r>
             <w:r>
               <w:rPr>
@@ -1085,7 +1079,7 @@
               <w:rPr>
                 <w:b/>
               </w:rPr>
-              <w:t>AskInput</w:t>
+              <w:t>{{consignor_gstin}}</w:t>
             </w:r>
             <w:r>
               <w:rPr>
@@ -1127,7 +1121,7 @@
               <w:rPr>
                 <w:b/>
               </w:rPr>
-              <w:t>AskInput</w:t>
+              <w:t>{{consignor_state_code}}</w:t>
             </w:r>
             <w:r>
               <w:rPr>
@@ -1178,7 +1172,7 @@
               <w:rPr>
                 <w:b/>
               </w:rPr>
-              <w:t>AskInput</w:t>
+              <w:t>{{consignee_state_code}}</w:t>
             </w:r>
           </w:p>
         </w:tc>
@@ -1995,7 +1989,7 @@
               <w:rPr>
                 <w:b/>
               </w:rPr>
-              <w:t>AskInput</w:t>
+              <w:t>{{sl_no}}</w:t>
             </w:r>
           </w:p>
         </w:tc>
@@ -2023,7 +2017,7 @@
               <w:rPr>
                 <w:b/>
               </w:rPr>
-              <w:t>AskInput</w:t>
+              <w:t>{{lr_number}}</w:t>
             </w:r>
           </w:p>
         </w:tc>
@@ -2050,7 +2044,7 @@
               <w:rPr>
                 <w:b/>
               </w:rPr>
-              <w:t>AskInput</w:t>
+              <w:t>{{lr_date}}</w:t>
             </w:r>
           </w:p>
         </w:tc>
@@ -2077,7 +2071,7 @@
               <w:rPr>
                 <w:b/>
               </w:rPr>
-              <w:t>AskInput</w:t>
+              <w:t>{{loading_location}}</w:t>
             </w:r>
           </w:p>
         </w:tc>
@@ -2104,7 +2098,7 @@
               <w:rPr>
                 <w:b/>
               </w:rPr>
-              <w:t>AskInput</w:t>
+              <w:t>{{unloading_location}}</w:t>
             </w:r>
           </w:p>
         </w:tc>
@@ -2131,7 +2125,7 @@
               <w:rPr>
                 <w:b/>
               </w:rPr>
-              <w:t>AskInput</w:t>
+              <w:t>{{goods_description}}</w:t>
             </w:r>
           </w:p>
         </w:tc>
@@ -2159,7 +2153,7 @@
               <w:rPr>
                 <w:b/>
               </w:rPr>
-              <w:t>AskInput</w:t>
+              <w:t>{{vehicle_number}}</w:t>
             </w:r>
           </w:p>
         </w:tc>
@@ -2187,7 +2181,7 @@
               <w:rPr>
                 <w:b/>
               </w:rPr>
-              <w:t>AskInput</w:t>
+              <w:t>{{packages}}</w:t>
             </w:r>
           </w:p>
         </w:tc>
@@ -2214,7 +2208,7 @@
               <w:rPr>
                 <w:b/>
               </w:rPr>
-              <w:t>AskInput</w:t>
+              <w:t>{{weight}}</w:t>
             </w:r>
           </w:p>
         </w:tc>
@@ -2241,7 +2235,7 @@
               <w:rPr>
                 <w:b/>
               </w:rPr>
-              <w:t>AskInput</w:t>
+              <w:t>{{rate}}</w:t>
             </w:r>
           </w:p>
         </w:tc>
@@ -2268,7 +2262,7 @@
               <w:rPr>
                 <w:b/>
               </w:rPr>
-              <w:t>AskInput</w:t>
+              <w:t>{{freight}}</w:t>
             </w:r>
           </w:p>
         </w:tc>
@@ -2296,7 +2290,7 @@
               <w:rPr>
                 <w:b/>
               </w:rPr>
-              <w:t>AskInput</w:t>
+              <w:t>{{other_charges}}</w:t>
             </w:r>
           </w:p>
         </w:tc>
@@ -2323,7 +2317,7 @@
               <w:rPr>
                 <w:b/>
               </w:rPr>
-              <w:t>AskInput</w:t>
+              <w:t>{{total}}</w:t>
             </w:r>
           </w:p>
         </w:tc>
@@ -3208,7 +3202,7 @@
               <w:rPr>
                 <w:b/>
               </w:rPr>
-              <w:t>AskInput</w:t>
+              <w:t>{{remarks}}</w:t>
             </w:r>
           </w:p>
         </w:tc>
@@ -3297,7 +3291,7 @@
               <w:rPr>
                 <w:b/>
               </w:rPr>
-              <w:t>AskInput</w:t>
+              <w:t>{{grand_total}}</w:t>
             </w:r>
           </w:p>
         </w:tc>
@@ -3376,7 +3370,7 @@
               <w:rPr>
                 <w:b/>
               </w:rPr>
-              <w:t>Generate auto Grand total text</w:t>
+              <w:t>{{amount_in_words}}</w:t>
             </w:r>
           </w:p>
         </w:tc>
@@ -3413,7 +3407,7 @@
               <mc:AlternateContent>
                 <mc:Choice Requires="wpg">
                   <w:drawing>
-                    <wp:anchor distT="0" distB="0" distL="0" distR="0" simplePos="0" relativeHeight="15730688" behindDoc="0" locked="0" layoutInCell="1" allowOverlap="1" wp14:anchorId="6B703932" wp14:editId="4B4F1DF0">
+                    <wp:anchor distT="0" distB="0" distL="0" distR="0" simplePos="0" relativeHeight="15730688" behindDoc="0" locked="0" layoutInCell="1" allowOverlap="1" ns4:anchorId="6B703932" ns4:editId="4B4F1DF0">
                       <wp:simplePos x="0" y="0"/>
                       <wp:positionH relativeFrom="column">
                         <wp:posOffset>7720583</wp:posOffset>
@@ -3426,9 +3420,9 @@
                       <wp:wrapNone/>
                       <wp:docPr id="3" name="Group 3"/>
                       <wp:cNvGraphicFramePr>
-                        <a:graphicFrameLocks xmlns:a="http://schemas.openxmlformats.org/drawingml/2006/main"/>
+                        <a:graphicFrameLocks/>
                       </wp:cNvGraphicFramePr>
-                      <a:graphic xmlns:a="http://schemas.openxmlformats.org/drawingml/2006/main">
+                      <a:graphic>
                         <a:graphicData uri="http://schemas.microsoft.com/office/word/2010/wordprocessingGroup">
                           <wpg:wgp>
                             <wpg:cNvGrpSpPr>
@@ -3442,7 +3436,7 @@
                                 <a:chExt cx="811530" cy="815975"/>
                               </a:xfrm>
                             </wpg:grpSpPr>
-                            <pic:pic xmlns:pic="http://schemas.openxmlformats.org/drawingml/2006/picture">
+                            <pic:pic>
                               <pic:nvPicPr>
                                 <pic:cNvPr id="4" name="Image 4"/>
                                 <pic:cNvPicPr/>
@@ -3471,9 +3465,9 @@
                 </mc:Choice>
                 <mc:Fallback>
                   <w:pict>
-                    <v:group w14:anchorId="1A93BF2F" id="Group 3" o:spid="_x0000_s1026" style="position:absolute;margin-left:607.9pt;margin-top:34.65pt;width:63.9pt;height:64.25pt;z-index:15730688;mso-wrap-distance-left:0;mso-wrap-distance-right:0" coordsize="8115,8159" o:gfxdata="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">
-                      <v:shape id="Image 4" o:spid="_x0000_s1027" type="#_x0000_t75" style="position:absolute;width:8114;height:8154;visibility:visible;mso-wrap-style:square" o:gfxdata="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">
-                        <v:imagedata r:id="rId8" o:title=""/>
+                    <v:group w14:anchorId="1A93BF2F" id="Group 3" ns10:spid="_x0000_s1026" style="position:absolute;margin-left:607.9pt;margin-top:34.65pt;width:63.9pt;height:64.25pt;z-index:15730688;mso-wrap-distance-left:0;mso-wrap-distance-right:0" coordsize="8115,8159" ns10:gfxdata="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">
+                      <v:shape id="Image 4" ns10:spid="_x0000_s1027" type="#_x0000_t75" style="position:absolute;width:8114;height:8154;visibility:visible;mso-wrap-style:square" ns10:gfxdata="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">
+                        <v:imagedata r:id="rId8" ns10:title=""/>
                       </v:shape>
                     </v:group>
                   </w:pict>
@@ -3500,7 +3494,7 @@
                 <w:b/>
                 <w:sz w:val="18"/>
               </w:rPr>
-              <w:t>U&amp;S</w:t>
+              <w:t>SR TRANSPORT</w:t>
             </w:r>
             <w:r>
               <w:rPr>
@@ -3508,14 +3502,14 @@
                 <w:spacing w:val="-3"/>
                 <w:sz w:val="18"/>
               </w:rPr>
-              <w:t xml:space="preserve"> </w:t>
-            </w:r>
-            <w:r>
-              <w:rPr>
-                <w:b/>
-                <w:sz w:val="18"/>
-              </w:rPr>
-              <w:t>Trans</w:t>
+              <w:t xml:space="preserve"/>
+            </w:r>
+            <w:r>
+              <w:rPr>
+                <w:b/>
+                <w:sz w:val="18"/>
+              </w:rPr>
+              <w:t/>
             </w:r>
             <w:r>
               <w:rPr>
@@ -3523,14 +3517,14 @@
                 <w:spacing w:val="-2"/>
                 <w:sz w:val="18"/>
               </w:rPr>
-              <w:t xml:space="preserve"> </w:t>
-            </w:r>
-            <w:r>
-              <w:rPr>
-                <w:b/>
-                <w:sz w:val="18"/>
-              </w:rPr>
-              <w:t>and</w:t>
+              <w:t xml:space="preserve"/>
+            </w:r>
+            <w:r>
+              <w:rPr>
+                <w:b/>
+                <w:sz w:val="18"/>
+              </w:rPr>
+              <w:t/>
             </w:r>
             <w:r>
               <w:rPr>
@@ -3538,14 +3532,14 @@
                 <w:spacing w:val="-5"/>
                 <w:sz w:val="18"/>
               </w:rPr>
-              <w:t xml:space="preserve"> </w:t>
-            </w:r>
-            <w:r>
-              <w:rPr>
-                <w:b/>
-                <w:sz w:val="18"/>
-              </w:rPr>
-              <w:t>Trade</w:t>
+              <w:t xml:space="preserve"/>
+            </w:r>
+            <w:r>
+              <w:rPr>
+                <w:b/>
+                <w:sz w:val="18"/>
+              </w:rPr>
+              <w:t/>
             </w:r>
             <w:r>
               <w:rPr>
@@ -3553,14 +3547,14 @@
                 <w:spacing w:val="-2"/>
                 <w:sz w:val="18"/>
               </w:rPr>
-              <w:t xml:space="preserve"> </w:t>
-            </w:r>
-            <w:r>
-              <w:rPr>
-                <w:b/>
-                <w:sz w:val="18"/>
-              </w:rPr>
-              <w:t>India</w:t>
+              <w:t xml:space="preserve"/>
+            </w:r>
+            <w:r>
+              <w:rPr>
+                <w:b/>
+                <w:sz w:val="18"/>
+              </w:rPr>
+              <w:t/>
             </w:r>
             <w:r>
               <w:rPr>
@@ -3568,14 +3562,14 @@
                 <w:spacing w:val="-2"/>
                 <w:sz w:val="18"/>
               </w:rPr>
-              <w:t xml:space="preserve"> </w:t>
-            </w:r>
-            <w:r>
-              <w:rPr>
-                <w:b/>
-                <w:sz w:val="18"/>
-              </w:rPr>
-              <w:t>Private</w:t>
+              <w:t xml:space="preserve"/>
+            </w:r>
+            <w:r>
+              <w:rPr>
+                <w:b/>
+                <w:sz w:val="18"/>
+              </w:rPr>
+              <w:t/>
             </w:r>
             <w:r>
               <w:rPr>
@@ -3583,7 +3577,7 @@
                 <w:spacing w:val="-2"/>
                 <w:sz w:val="18"/>
               </w:rPr>
-              <w:t xml:space="preserve"> Limited</w:t>
+              <w:t xml:space="preserve"/>
             </w:r>
           </w:p>
           <w:p>
@@ -3605,7 +3599,7 @@
               <mc:AlternateContent>
                 <mc:Choice Requires="wpg">
                   <w:drawing>
-                    <wp:anchor distT="0" distB="0" distL="0" distR="0" simplePos="0" relativeHeight="487418880" behindDoc="1" locked="0" layoutInCell="1" allowOverlap="1" wp14:anchorId="353C53E2" wp14:editId="666ADAD1">
+                    <wp:anchor distT="0" distB="0" distL="0" distR="0" simplePos="0" relativeHeight="487418880" behindDoc="1" locked="0" layoutInCell="1" allowOverlap="1" ns4:anchorId="353C53E2" ns4:editId="666ADAD1">
                       <wp:simplePos x="0" y="0"/>
                       <wp:positionH relativeFrom="column">
                         <wp:posOffset>4055871</wp:posOffset>
@@ -3618,9 +3612,9 @@
                       <wp:wrapNone/>
                       <wp:docPr id="5" name="Group 5"/>
                       <wp:cNvGraphicFramePr>
-                        <a:graphicFrameLocks xmlns:a="http://schemas.openxmlformats.org/drawingml/2006/main"/>
+                        <a:graphicFrameLocks/>
                       </wp:cNvGraphicFramePr>
-                      <a:graphic xmlns:a="http://schemas.openxmlformats.org/drawingml/2006/main">
+                      <a:graphic>
                         <a:graphicData uri="http://schemas.microsoft.com/office/word/2010/wordprocessingGroup">
                           <wpg:wgp>
                             <wpg:cNvGrpSpPr>
@@ -3634,10 +3628,10 @@
                                 <a:chExt cx="2469515" cy="934719"/>
                               </a:xfrm>
                             </wpg:grpSpPr>
-                            <wps:wsp>
-                              <wps:cNvPr id="6" name="Graphic 6"/>
-                              <wps:cNvSpPr/>
-                              <wps:spPr>
+                            <ns11:wsp>
+                              <ns11:cNvPr id="6" name="Graphic 6"/>
+                              <ns11:cNvSpPr/>
+                              <ns11:spPr>
                                 <a:xfrm>
                                   <a:off x="13080" y="889"/>
                                   <a:ext cx="2455545" cy="1270"/>
@@ -3665,18 +3659,18 @@
                                   </a:solidFill>
                                   <a:prstDash val="solid"/>
                                 </a:ln>
-                              </wps:spPr>
-                              <wps:bodyPr wrap="square" lIns="0" tIns="0" rIns="0" bIns="0" rtlCol="0">
+                              </ns11:spPr>
+                              <ns11:bodyPr wrap="square" lIns="0" tIns="0" rIns="0" bIns="0" rtlCol="0">
                                 <a:prstTxWarp prst="textNoShape">
                                   <a:avLst/>
                                 </a:prstTxWarp>
                                 <a:noAutofit/>
-                              </wps:bodyPr>
-                            </wps:wsp>
-                            <wps:wsp>
-                              <wps:cNvPr id="7" name="Graphic 7"/>
-                              <wps:cNvSpPr/>
-                              <wps:spPr>
+                              </ns11:bodyPr>
+                            </ns11:wsp>
+                            <ns11:wsp>
+                              <ns11:cNvPr id="7" name="Graphic 7"/>
+                              <ns11:cNvSpPr/>
+                              <ns11:spPr>
                                 <a:xfrm>
                                   <a:off x="12319" y="127"/>
                                   <a:ext cx="2457450" cy="12700"/>
@@ -3711,18 +3705,18 @@
                                 <a:solidFill>
                                   <a:srgbClr val="000000"/>
                                 </a:solidFill>
-                              </wps:spPr>
-                              <wps:bodyPr wrap="square" lIns="0" tIns="0" rIns="0" bIns="0" rtlCol="0">
+                              </ns11:spPr>
+                              <ns11:bodyPr wrap="square" lIns="0" tIns="0" rIns="0" bIns="0" rtlCol="0">
                                 <a:prstTxWarp prst="textNoShape">
                                   <a:avLst/>
                                 </a:prstTxWarp>
                                 <a:noAutofit/>
-                              </wps:bodyPr>
-                            </wps:wsp>
-                            <wps:wsp>
-                              <wps:cNvPr id="8" name="Graphic 8"/>
-                              <wps:cNvSpPr/>
-                              <wps:spPr>
+                              </ns11:bodyPr>
+                            </ns11:wsp>
+                            <ns11:wsp>
+                              <ns11:cNvPr id="8" name="Graphic 8"/>
+                              <ns11:cNvSpPr/>
+                              <ns11:spPr>
                                 <a:xfrm>
                                   <a:off x="889" y="889"/>
                                   <a:ext cx="1270" cy="932815"/>
@@ -3750,18 +3744,18 @@
                                   </a:solidFill>
                                   <a:prstDash val="solid"/>
                                 </a:ln>
-                              </wps:spPr>
-                              <wps:bodyPr wrap="square" lIns="0" tIns="0" rIns="0" bIns="0" rtlCol="0">
+                              </ns11:spPr>
+                              <ns11:bodyPr wrap="square" lIns="0" tIns="0" rIns="0" bIns="0" rtlCol="0">
                                 <a:prstTxWarp prst="textNoShape">
                                   <a:avLst/>
                                 </a:prstTxWarp>
                                 <a:noAutofit/>
-                              </wps:bodyPr>
-                            </wps:wsp>
-                            <wps:wsp>
-                              <wps:cNvPr id="9" name="Graphic 9"/>
-                              <wps:cNvSpPr/>
-                              <wps:spPr>
+                              </ns11:bodyPr>
+                            </ns11:wsp>
+                            <ns11:wsp>
+                              <ns11:cNvPr id="9" name="Graphic 9"/>
+                              <ns11:cNvSpPr/>
+                              <ns11:spPr>
                                 <a:xfrm>
                                   <a:off x="126" y="126"/>
                                   <a:ext cx="12700" cy="934719"/>
@@ -3796,18 +3790,18 @@
                                 <a:solidFill>
                                   <a:srgbClr val="000000"/>
                                 </a:solidFill>
-                              </wps:spPr>
-                              <wps:bodyPr wrap="square" lIns="0" tIns="0" rIns="0" bIns="0" rtlCol="0">
+                              </ns11:spPr>
+                              <ns11:bodyPr wrap="square" lIns="0" tIns="0" rIns="0" bIns="0" rtlCol="0">
                                 <a:prstTxWarp prst="textNoShape">
                                   <a:avLst/>
                                 </a:prstTxWarp>
                                 <a:noAutofit/>
-                              </wps:bodyPr>
-                            </wps:wsp>
-                            <wps:wsp>
-                              <wps:cNvPr id="10" name="Graphic 10"/>
-                              <wps:cNvSpPr/>
-                              <wps:spPr>
+                              </ns11:bodyPr>
+                            </ns11:wsp>
+                            <ns11:wsp>
+                              <ns11:cNvPr id="10" name="Graphic 10"/>
+                              <ns11:cNvSpPr/>
+                              <ns11:spPr>
                                 <a:xfrm>
                                   <a:off x="13080" y="922908"/>
                                   <a:ext cx="2455545" cy="1270"/>
@@ -3835,18 +3829,18 @@
                                   </a:solidFill>
                                   <a:prstDash val="solid"/>
                                 </a:ln>
-                              </wps:spPr>
-                              <wps:bodyPr wrap="square" lIns="0" tIns="0" rIns="0" bIns="0" rtlCol="0">
+                              </ns11:spPr>
+                              <ns11:bodyPr wrap="square" lIns="0" tIns="0" rIns="0" bIns="0" rtlCol="0">
                                 <a:prstTxWarp prst="textNoShape">
                                   <a:avLst/>
                                 </a:prstTxWarp>
                                 <a:noAutofit/>
-                              </wps:bodyPr>
-                            </wps:wsp>
-                            <wps:wsp>
-                              <wps:cNvPr id="11" name="Graphic 11"/>
-                              <wps:cNvSpPr/>
-                              <wps:spPr>
+                              </ns11:bodyPr>
+                            </ns11:wsp>
+                            <ns11:wsp>
+                              <ns11:cNvPr id="11" name="Graphic 11"/>
+                              <ns11:cNvSpPr/>
+                              <ns11:spPr>
                                 <a:xfrm>
                                   <a:off x="12319" y="922147"/>
                                   <a:ext cx="2457450" cy="12700"/>
@@ -3881,18 +3875,18 @@
                                 <a:solidFill>
                                   <a:srgbClr val="000000"/>
                                 </a:solidFill>
-                              </wps:spPr>
-                              <wps:bodyPr wrap="square" lIns="0" tIns="0" rIns="0" bIns="0" rtlCol="0">
+                              </ns11:spPr>
+                              <ns11:bodyPr wrap="square" lIns="0" tIns="0" rIns="0" bIns="0" rtlCol="0">
                                 <a:prstTxWarp prst="textNoShape">
                                   <a:avLst/>
                                 </a:prstTxWarp>
                                 <a:noAutofit/>
-                              </wps:bodyPr>
-                            </wps:wsp>
-                            <wps:wsp>
-                              <wps:cNvPr id="12" name="Graphic 12"/>
-                              <wps:cNvSpPr/>
-                              <wps:spPr>
+                              </ns11:bodyPr>
+                            </ns11:wsp>
+                            <ns11:wsp>
+                              <ns11:cNvPr id="12" name="Graphic 12"/>
+                              <ns11:cNvSpPr/>
+                              <ns11:spPr>
                                 <a:xfrm>
                                   <a:off x="2457830" y="13080"/>
                                   <a:ext cx="1270" cy="920750"/>
@@ -3920,18 +3914,18 @@
                                   </a:solidFill>
                                   <a:prstDash val="solid"/>
                                 </a:ln>
-                              </wps:spPr>
-                              <wps:bodyPr wrap="square" lIns="0" tIns="0" rIns="0" bIns="0" rtlCol="0">
+                              </ns11:spPr>
+                              <ns11:bodyPr wrap="square" lIns="0" tIns="0" rIns="0" bIns="0" rtlCol="0">
                                 <a:prstTxWarp prst="textNoShape">
                                   <a:avLst/>
                                 </a:prstTxWarp>
                                 <a:noAutofit/>
-                              </wps:bodyPr>
-                            </wps:wsp>
-                            <wps:wsp>
-                              <wps:cNvPr id="13" name="Graphic 13"/>
-                              <wps:cNvSpPr/>
-                              <wps:spPr>
+                              </ns11:bodyPr>
+                            </ns11:wsp>
+                            <ns11:wsp>
+                              <ns11:cNvPr id="13" name="Graphic 13"/>
+                              <ns11:cNvSpPr/>
+                              <ns11:spPr>
                                 <a:xfrm>
                                   <a:off x="2457069" y="12319"/>
                                   <a:ext cx="12700" cy="922019"/>
@@ -3966,14 +3960,14 @@
                                 <a:solidFill>
                                   <a:srgbClr val="000000"/>
                                 </a:solidFill>
-                              </wps:spPr>
-                              <wps:bodyPr wrap="square" lIns="0" tIns="0" rIns="0" bIns="0" rtlCol="0">
+                              </ns11:spPr>
+                              <ns11:bodyPr wrap="square" lIns="0" tIns="0" rIns="0" bIns="0" rtlCol="0">
                                 <a:prstTxWarp prst="textNoShape">
                                   <a:avLst/>
                                 </a:prstTxWarp>
                                 <a:noAutofit/>
-                              </wps:bodyPr>
-                            </wps:wsp>
+                              </ns11:bodyPr>
+                            </ns11:wsp>
                           </wpg:wgp>
                         </a:graphicData>
                       </a:graphic>
@@ -3982,29 +3976,29 @@
                 </mc:Choice>
                 <mc:Fallback>
                   <w:pict>
-                    <v:group w14:anchorId="60CFAB14" id="Group 5" o:spid="_x0000_s1026" style="position:absolute;margin-left:319.35pt;margin-top:.7pt;width:194.45pt;height:73.6pt;z-index:-15897600;mso-wrap-distance-left:0;mso-wrap-distance-right:0" coordsize="24695,9347" o:gfxdata="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">
-                      <v:shape id="Graphic 6" o:spid="_x0000_s1027" style="position:absolute;left:130;top:8;width:24556;height:13;visibility:visible;mso-wrap-style:square;v-text-anchor:top" coordsize="2455545,1270" o:gfxdata="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" path="m,l2455417,e" filled="f" strokeweight=".14pt">
+                    <v:group w14:anchorId="60CFAB14" id="Group 5" ns10:spid="_x0000_s1026" style="position:absolute;margin-left:319.35pt;margin-top:.7pt;width:194.45pt;height:73.6pt;z-index:-15897600;mso-wrap-distance-left:0;mso-wrap-distance-right:0" coordsize="24695,9347" ns10:gfxdata="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">
+                      <v:shape id="Graphic 6" ns10:spid="_x0000_s1027" style="position:absolute;left:130;top:8;width:24556;height:13;visibility:visible;mso-wrap-style:square;v-text-anchor:top" coordsize="2455545,1270" ns10:gfxdata="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" path="m,l2455417,e" filled="f" strokeweight=".14pt">
                         <v:path arrowok="t"/>
                       </v:shape>
-                      <v:shape id="Graphic 7" o:spid="_x0000_s1028" style="position:absolute;left:123;top:1;width:24574;height:127;visibility:visible;mso-wrap-style:square;v-text-anchor:top" coordsize="2457450,12700" o:gfxdata="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" path="m2456942,l,,,12191r2456942,l2456942,xe" fillcolor="black" stroked="f">
+                      <v:shape id="Graphic 7" ns10:spid="_x0000_s1028" style="position:absolute;left:123;top:1;width:24574;height:127;visibility:visible;mso-wrap-style:square;v-text-anchor:top" coordsize="2457450,12700" ns10:gfxdata="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" path="m2456942,l,,,12191r2456942,l2456942,xe" fillcolor="black" stroked="f">
                         <v:path arrowok="t"/>
                       </v:shape>
-                      <v:shape id="Graphic 8" o:spid="_x0000_s1029" style="position:absolute;left:8;top:8;width:13;height:9329;visibility:visible;mso-wrap-style:square;v-text-anchor:top" coordsize="1270,932815" o:gfxdata="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" path="m,l,932687e" filled="f" strokeweight=".14pt">
+                      <v:shape id="Graphic 8" ns10:spid="_x0000_s1029" style="position:absolute;left:8;top:8;width:13;height:9329;visibility:visible;mso-wrap-style:square;v-text-anchor:top" coordsize="1270,932815" ns10:gfxdata="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" path="m,l,932687e" filled="f" strokeweight=".14pt">
                         <v:path arrowok="t"/>
                       </v:shape>
-                      <v:shape id="Graphic 9" o:spid="_x0000_s1030" style="position:absolute;left:1;top:1;width:127;height:9347;visibility:visible;mso-wrap-style:square;v-text-anchor:top" coordsize="12700,934719" o:gfxdata="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" path="m12191,l,,,934212r12191,l12191,xe" fillcolor="black" stroked="f">
+                      <v:shape id="Graphic 9" ns10:spid="_x0000_s1030" style="position:absolute;left:1;top:1;width:127;height:9347;visibility:visible;mso-wrap-style:square;v-text-anchor:top" coordsize="12700,934719" ns10:gfxdata="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" path="m12191,l,,,934212r12191,l12191,xe" fillcolor="black" stroked="f">
                         <v:path arrowok="t"/>
                       </v:shape>
-                      <v:shape id="Graphic 10" o:spid="_x0000_s1031" style="position:absolute;left:130;top:9229;width:24556;height:12;visibility:visible;mso-wrap-style:square;v-text-anchor:top" coordsize="2455545,1270" o:gfxdata="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" path="m,l2455417,e" filled="f" strokeweight=".14pt">
+                      <v:shape id="Graphic 10" ns10:spid="_x0000_s1031" style="position:absolute;left:130;top:9229;width:24556;height:12;visibility:visible;mso-wrap-style:square;v-text-anchor:top" coordsize="2455545,1270" ns10:gfxdata="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" path="m,l2455417,e" filled="f" strokeweight=".14pt">
                         <v:path arrowok="t"/>
                       </v:shape>
-                      <v:shape id="Graphic 11" o:spid="_x0000_s1032" style="position:absolute;left:123;top:9221;width:24574;height:127;visibility:visible;mso-wrap-style:square;v-text-anchor:top" coordsize="2457450,12700" o:gfxdata="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" path="m2456942,l,,,12191r2456942,l2456942,xe" fillcolor="black" stroked="f">
+                      <v:shape id="Graphic 11" ns10:spid="_x0000_s1032" style="position:absolute;left:123;top:9221;width:24574;height:127;visibility:visible;mso-wrap-style:square;v-text-anchor:top" coordsize="2457450,12700" ns10:gfxdata="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" path="m2456942,l,,,12191r2456942,l2456942,xe" fillcolor="black" stroked="f">
                         <v:path arrowok="t"/>
                       </v:shape>
-                      <v:shape id="Graphic 12" o:spid="_x0000_s1033" style="position:absolute;left:24578;top:130;width:13;height:9208;visibility:visible;mso-wrap-style:square;v-text-anchor:top" coordsize="1270,920750" o:gfxdata="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" path="m,l,920495e" filled="f" strokeweight=".14pt">
+                      <v:shape id="Graphic 12" ns10:spid="_x0000_s1033" style="position:absolute;left:24578;top:130;width:13;height:9208;visibility:visible;mso-wrap-style:square;v-text-anchor:top" coordsize="1270,920750" ns10:gfxdata="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" path="m,l,920495e" filled="f" strokeweight=".14pt">
                         <v:path arrowok="t"/>
                       </v:shape>
-                      <v:shape id="Graphic 13" o:spid="_x0000_s1034" style="position:absolute;left:24570;top:123;width:127;height:9220;visibility:visible;mso-wrap-style:square;v-text-anchor:top" coordsize="12700,922019" o:gfxdata="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" path="m12191,l,,,922019r12191,l12191,xe" fillcolor="black" stroked="f">
+                      <v:shape id="Graphic 13" ns10:spid="_x0000_s1034" style="position:absolute;left:24570;top:123;width:127;height:9220;visibility:visible;mso-wrap-style:square;v-text-anchor:top" coordsize="12700,922019" ns10:gfxdata="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" path="m12191,l,,,922019r12191,l12191,xe" fillcolor="black" stroked="f">
                         <v:path arrowok="t"/>
                       </v:shape>
                     </v:group>
@@ -4124,7 +4118,7 @@
                 <w:spacing w:val="-2"/>
                 <w:sz w:val="16"/>
               </w:rPr>
-              <w:t xml:space="preserve"> AABCU4071B</w:t>
+              <w:t xml:space="preserve"> ELKPK3812H</w:t>
             </w:r>
             <w:r>
               <w:rPr>
@@ -4226,7 +4220,7 @@
                 <w:b/>
                 <w:sz w:val="16"/>
               </w:rPr>
-              <w:t>GSTIN:</w:t>
+              <w:t>Reg No:</w:t>
             </w:r>
             <w:r>
               <w:rPr>
@@ -4234,7 +4228,7 @@
                 <w:spacing w:val="-2"/>
                 <w:sz w:val="16"/>
               </w:rPr>
-              <w:t xml:space="preserve"> 36AABCU4071B1ZP</w:t>
+              <w:t xml:space="preserve"> SEA/SAN/ALO/PC/0607538/2023</w:t>
             </w:r>
             <w:r>
               <w:rPr>
@@ -4293,7 +4287,7 @@
                 <w:spacing w:val="-2"/>
                 <w:sz w:val="18"/>
               </w:rPr>
-              <w:t>7711192345</w:t>
+              <w:t>1720252626</w:t>
             </w:r>
           </w:p>
           <w:p>
@@ -4353,27 +4347,27 @@
                 <w:sz w:val="18"/>
               </w:rPr>
               <w:tab/>
-              <w:t>Sarojini</w:t>
+              <w:t>Chandanagar</w:t>
             </w:r>
             <w:r>
               <w:rPr>
                 <w:spacing w:val="-8"/>
                 <w:sz w:val="18"/>
               </w:rPr>
-              <w:t xml:space="preserve"> </w:t>
-            </w:r>
-            <w:r>
-              <w:rPr>
-                <w:sz w:val="18"/>
-              </w:rPr>
-              <w:t>Devi</w:t>
+              <w:t xml:space="preserve"/>
+            </w:r>
+            <w:r>
+              <w:rPr>
+                <w:sz w:val="18"/>
+              </w:rPr>
+              <w:t/>
             </w:r>
             <w:r>
               <w:rPr>
                 <w:spacing w:val="-4"/>
                 <w:sz w:val="18"/>
               </w:rPr>
-              <w:t xml:space="preserve"> Road</w:t>
+              <w:t xml:space="preserve"/>
             </w:r>
             <w:r>
               <w:rPr>
@@ -4424,7 +4418,7 @@
                 <w:b/>
                 <w:sz w:val="16"/>
               </w:rPr>
-              <w:t>CIN:</w:t>
+              <w:t>Udyam:</w:t>
             </w:r>
             <w:r>
               <w:rPr>
@@ -4440,7 +4434,7 @@
                 <w:spacing w:val="-2"/>
                 <w:sz w:val="16"/>
               </w:rPr>
-              <w:t>U63090TG2012PTC078380</w:t>
+              <w:t>UDYAM-TS-25-0001670</w:t>
             </w:r>
             <w:r>
               <w:rPr>
@@ -4480,7 +4474,7 @@
                 <w:spacing w:val="-2"/>
                 <w:sz w:val="18"/>
               </w:rPr>
-              <w:t>KKBK0000554</w:t>
+              <w:t>KKBK0007489</w:t>
             </w:r>
           </w:p>
           <w:p>
@@ -4498,7 +4492,7 @@
                 <w:b/>
                 <w:sz w:val="16"/>
               </w:rPr>
-              <w:t>Udyam</w:t>
+              <w:t>* GST to be paid by Service Recipient</w:t>
             </w:r>
             <w:r>
               <w:rPr>
@@ -4506,14 +4500,14 @@
                 <w:spacing w:val="-6"/>
                 <w:sz w:val="16"/>
               </w:rPr>
-              <w:t xml:space="preserve"> </w:t>
+              <w:t xml:space="preserve"/>
             </w:r>
             <w:r>
               <w:rPr>
                 <w:b/>
                 <w:sz w:val="16"/>
               </w:rPr>
-              <w:t>Certificate:</w:t>
+              <w:t/>
             </w:r>
             <w:r>
               <w:rPr>
@@ -4521,14 +4515,14 @@
                 <w:spacing w:val="-6"/>
                 <w:sz w:val="16"/>
               </w:rPr>
-              <w:t xml:space="preserve"> </w:t>
+              <w:t xml:space="preserve"/>
             </w:r>
             <w:r>
               <w:rPr>
                 <w:b/>
                 <w:sz w:val="16"/>
               </w:rPr>
-              <w:t>UDYAM-TS-02-</w:t>
+              <w:t/>
             </w:r>
             <w:r>
               <w:rPr>
@@ -4536,7 +4530,7 @@
                 <w:spacing w:val="-2"/>
                 <w:sz w:val="16"/>
               </w:rPr>
-              <w:t>0048963</w:t>
+              <w:t/>
             </w:r>
           </w:p>
           <w:p>
@@ -4557,7 +4551,7 @@
               <mc:AlternateContent>
                 <mc:Choice Requires="wpg">
                   <w:drawing>
-                    <wp:anchor distT="0" distB="0" distL="0" distR="0" simplePos="0" relativeHeight="487419392" behindDoc="1" locked="0" layoutInCell="1" allowOverlap="1" wp14:anchorId="2C597C56" wp14:editId="0003C51D">
+                    <wp:anchor distT="0" distB="0" distL="0" distR="0" simplePos="0" relativeHeight="487419392" behindDoc="1" locked="0" layoutInCell="1" allowOverlap="1" ns4:anchorId="2C597C56" ns4:editId="0003C51D">
                       <wp:simplePos x="0" y="0"/>
                       <wp:positionH relativeFrom="column">
                         <wp:posOffset>4055871</wp:posOffset>
@@ -4570,9 +4564,9 @@
                       <wp:wrapNone/>
                       <wp:docPr id="14" name="Group 14"/>
                       <wp:cNvGraphicFramePr>
-                        <a:graphicFrameLocks xmlns:a="http://schemas.openxmlformats.org/drawingml/2006/main"/>
+                        <a:graphicFrameLocks/>
                       </wp:cNvGraphicFramePr>
-                      <a:graphic xmlns:a="http://schemas.openxmlformats.org/drawingml/2006/main">
+                      <a:graphic>
                         <a:graphicData uri="http://schemas.microsoft.com/office/word/2010/wordprocessingGroup">
                           <wpg:wgp>
                             <wpg:cNvGrpSpPr>
@@ -4586,10 +4580,10 @@
                                 <a:chExt cx="2469515" cy="197485"/>
                               </a:xfrm>
                             </wpg:grpSpPr>
-                            <wps:wsp>
-                              <wps:cNvPr id="15" name="Graphic 15"/>
-                              <wps:cNvSpPr/>
-                              <wps:spPr>
+                            <ns11:wsp>
+                              <ns11:cNvPr id="15" name="Graphic 15"/>
+                              <ns11:cNvSpPr/>
+                              <ns11:spPr>
                                 <a:xfrm>
                                   <a:off x="13080" y="889"/>
                                   <a:ext cx="2455545" cy="1270"/>
@@ -4617,18 +4611,18 @@
                                   </a:solidFill>
                                   <a:prstDash val="solid"/>
                                 </a:ln>
-                              </wps:spPr>
-                              <wps:bodyPr wrap="square" lIns="0" tIns="0" rIns="0" bIns="0" rtlCol="0">
+                              </ns11:spPr>
+                              <ns11:bodyPr wrap="square" lIns="0" tIns="0" rIns="0" bIns="0" rtlCol="0">
                                 <a:prstTxWarp prst="textNoShape">
                                   <a:avLst/>
                                 </a:prstTxWarp>
                                 <a:noAutofit/>
-                              </wps:bodyPr>
-                            </wps:wsp>
-                            <wps:wsp>
-                              <wps:cNvPr id="16" name="Graphic 16"/>
-                              <wps:cNvSpPr/>
-                              <wps:spPr>
+                              </ns11:bodyPr>
+                            </ns11:wsp>
+                            <ns11:wsp>
+                              <ns11:cNvPr id="16" name="Graphic 16"/>
+                              <ns11:cNvSpPr/>
+                              <ns11:spPr>
                                 <a:xfrm>
                                   <a:off x="12319" y="126"/>
                                   <a:ext cx="2457450" cy="12700"/>
@@ -4663,18 +4657,18 @@
                                 <a:solidFill>
                                   <a:srgbClr val="000000"/>
                                 </a:solidFill>
-                              </wps:spPr>
-                              <wps:bodyPr wrap="square" lIns="0" tIns="0" rIns="0" bIns="0" rtlCol="0">
+                              </ns11:spPr>
+                              <ns11:bodyPr wrap="square" lIns="0" tIns="0" rIns="0" bIns="0" rtlCol="0">
                                 <a:prstTxWarp prst="textNoShape">
                                   <a:avLst/>
                                 </a:prstTxWarp>
                                 <a:noAutofit/>
-                              </wps:bodyPr>
-                            </wps:wsp>
-                            <wps:wsp>
-                              <wps:cNvPr id="17" name="Graphic 17"/>
-                              <wps:cNvSpPr/>
-                              <wps:spPr>
+                              </ns11:bodyPr>
+                            </ns11:wsp>
+                            <ns11:wsp>
+                              <ns11:cNvPr id="17" name="Graphic 17"/>
+                              <ns11:cNvSpPr/>
+                              <ns11:spPr>
                                 <a:xfrm>
                                   <a:off x="889" y="889"/>
                                   <a:ext cx="1270" cy="195580"/>
@@ -4702,18 +4696,18 @@
                                   </a:solidFill>
                                   <a:prstDash val="solid"/>
                                 </a:ln>
-                              </wps:spPr>
-                              <wps:bodyPr wrap="square" lIns="0" tIns="0" rIns="0" bIns="0" rtlCol="0">
+                              </ns11:spPr>
+                              <ns11:bodyPr wrap="square" lIns="0" tIns="0" rIns="0" bIns="0" rtlCol="0">
                                 <a:prstTxWarp prst="textNoShape">
                                   <a:avLst/>
                                 </a:prstTxWarp>
                                 <a:noAutofit/>
-                              </wps:bodyPr>
-                            </wps:wsp>
-                            <wps:wsp>
-                              <wps:cNvPr id="18" name="Graphic 18"/>
-                              <wps:cNvSpPr/>
-                              <wps:spPr>
+                              </ns11:bodyPr>
+                            </ns11:wsp>
+                            <ns11:wsp>
+                              <ns11:cNvPr id="18" name="Graphic 18"/>
+                              <ns11:cNvSpPr/>
+                              <ns11:spPr>
                                 <a:xfrm>
                                   <a:off x="126" y="126"/>
                                   <a:ext cx="12700" cy="197485"/>
@@ -4748,18 +4742,18 @@
                                 <a:solidFill>
                                   <a:srgbClr val="000000"/>
                                 </a:solidFill>
-                              </wps:spPr>
-                              <wps:bodyPr wrap="square" lIns="0" tIns="0" rIns="0" bIns="0" rtlCol="0">
+                              </ns11:spPr>
+                              <ns11:bodyPr wrap="square" lIns="0" tIns="0" rIns="0" bIns="0" rtlCol="0">
                                 <a:prstTxWarp prst="textNoShape">
                                   <a:avLst/>
                                 </a:prstTxWarp>
                                 <a:noAutofit/>
-                              </wps:bodyPr>
-                            </wps:wsp>
-                            <wps:wsp>
-                              <wps:cNvPr id="19" name="Graphic 19"/>
-                              <wps:cNvSpPr/>
-                              <wps:spPr>
+                              </ns11:bodyPr>
+                            </ns11:wsp>
+                            <ns11:wsp>
+                              <ns11:cNvPr id="19" name="Graphic 19"/>
+                              <ns11:cNvSpPr/>
+                              <ns11:spPr>
                                 <a:xfrm>
                                   <a:off x="13080" y="185597"/>
                                   <a:ext cx="2455545" cy="1270"/>
@@ -4787,18 +4781,18 @@
                                   </a:solidFill>
                                   <a:prstDash val="solid"/>
                                 </a:ln>
-                              </wps:spPr>
-                              <wps:bodyPr wrap="square" lIns="0" tIns="0" rIns="0" bIns="0" rtlCol="0">
+                              </ns11:spPr>
+                              <ns11:bodyPr wrap="square" lIns="0" tIns="0" rIns="0" bIns="0" rtlCol="0">
                                 <a:prstTxWarp prst="textNoShape">
                                   <a:avLst/>
                                 </a:prstTxWarp>
                                 <a:noAutofit/>
-                              </wps:bodyPr>
-                            </wps:wsp>
-                            <wps:wsp>
-                              <wps:cNvPr id="20" name="Graphic 20"/>
-                              <wps:cNvSpPr/>
-                              <wps:spPr>
+                              </ns11:bodyPr>
+                            </ns11:wsp>
+                            <ns11:wsp>
+                              <ns11:cNvPr id="20" name="Graphic 20"/>
+                              <ns11:cNvSpPr/>
+                              <ns11:spPr>
                                 <a:xfrm>
                                   <a:off x="12319" y="184836"/>
                                   <a:ext cx="2457450" cy="12700"/>
@@ -4833,18 +4827,18 @@
                                 <a:solidFill>
                                   <a:srgbClr val="000000"/>
                                 </a:solidFill>
-                              </wps:spPr>
-                              <wps:bodyPr wrap="square" lIns="0" tIns="0" rIns="0" bIns="0" rtlCol="0">
+                              </ns11:spPr>
+                              <ns11:bodyPr wrap="square" lIns="0" tIns="0" rIns="0" bIns="0" rtlCol="0">
                                 <a:prstTxWarp prst="textNoShape">
                                   <a:avLst/>
                                 </a:prstTxWarp>
                                 <a:noAutofit/>
-                              </wps:bodyPr>
-                            </wps:wsp>
-                            <wps:wsp>
-                              <wps:cNvPr id="21" name="Graphic 21"/>
-                              <wps:cNvSpPr/>
-                              <wps:spPr>
+                              </ns11:bodyPr>
+                            </ns11:wsp>
+                            <ns11:wsp>
+                              <ns11:cNvPr id="21" name="Graphic 21"/>
+                              <ns11:cNvSpPr/>
+                              <ns11:spPr>
                                 <a:xfrm>
                                   <a:off x="2457830" y="13385"/>
                                   <a:ext cx="1270" cy="182880"/>
@@ -4872,18 +4866,18 @@
                                   </a:solidFill>
                                   <a:prstDash val="solid"/>
                                 </a:ln>
-                              </wps:spPr>
-                              <wps:bodyPr wrap="square" lIns="0" tIns="0" rIns="0" bIns="0" rtlCol="0">
+                              </ns11:spPr>
+                              <ns11:bodyPr wrap="square" lIns="0" tIns="0" rIns="0" bIns="0" rtlCol="0">
                                 <a:prstTxWarp prst="textNoShape">
                                   <a:avLst/>
                                 </a:prstTxWarp>
                                 <a:noAutofit/>
-                              </wps:bodyPr>
-                            </wps:wsp>
-                            <wps:wsp>
-                              <wps:cNvPr id="22" name="Graphic 22"/>
-                              <wps:cNvSpPr/>
-                              <wps:spPr>
+                              </ns11:bodyPr>
+                            </ns11:wsp>
+                            <ns11:wsp>
+                              <ns11:cNvPr id="22" name="Graphic 22"/>
+                              <ns11:cNvSpPr/>
+                              <ns11:spPr>
                                 <a:xfrm>
                                   <a:off x="2457069" y="12623"/>
                                   <a:ext cx="12700" cy="184785"/>
@@ -4918,14 +4912,14 @@
                                 <a:solidFill>
                                   <a:srgbClr val="000000"/>
                                 </a:solidFill>
-                              </wps:spPr>
-                              <wps:bodyPr wrap="square" lIns="0" tIns="0" rIns="0" bIns="0" rtlCol="0">
+                              </ns11:spPr>
+                              <ns11:bodyPr wrap="square" lIns="0" tIns="0" rIns="0" bIns="0" rtlCol="0">
                                 <a:prstTxWarp prst="textNoShape">
                                   <a:avLst/>
                                 </a:prstTxWarp>
                                 <a:noAutofit/>
-                              </wps:bodyPr>
-                            </wps:wsp>
+                              </ns11:bodyPr>
+                            </ns11:wsp>
                           </wpg:wgp>
                         </a:graphicData>
                       </a:graphic>
@@ -4934,29 +4928,29 @@
                 </mc:Choice>
                 <mc:Fallback>
                   <w:pict>
-                    <v:group w14:anchorId="32688C6B" id="Group 14" o:spid="_x0000_s1026" style="position:absolute;margin-left:319.35pt;margin-top:1pt;width:194.45pt;height:15.55pt;z-index:-15897088;mso-wrap-distance-left:0;mso-wrap-distance-right:0" coordsize="24695,1974" o:gfxdata="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">
-                      <v:shape id="Graphic 15" o:spid="_x0000_s1027" style="position:absolute;left:130;top:8;width:24556;height:13;visibility:visible;mso-wrap-style:square;v-text-anchor:top" coordsize="2455545,1270" o:gfxdata="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" path="m,l2455417,e" filled="f" strokeweight=".14pt">
+                    <v:group w14:anchorId="32688C6B" id="Group 14" ns10:spid="_x0000_s1026" style="position:absolute;margin-left:319.35pt;margin-top:1pt;width:194.45pt;height:15.55pt;z-index:-15897088;mso-wrap-distance-left:0;mso-wrap-distance-right:0" coordsize="24695,1974" ns10:gfxdata="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">
+                      <v:shape id="Graphic 15" ns10:spid="_x0000_s1027" style="position:absolute;left:130;top:8;width:24556;height:13;visibility:visible;mso-wrap-style:square;v-text-anchor:top" coordsize="2455545,1270" ns10:gfxdata="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" path="m,l2455417,e" filled="f" strokeweight=".14pt">
                         <v:path arrowok="t"/>
                       </v:shape>
-                      <v:shape id="Graphic 16" o:spid="_x0000_s1028" style="position:absolute;left:123;top:1;width:24574;height:127;visibility:visible;mso-wrap-style:square;v-text-anchor:top" coordsize="2457450,12700" o:gfxdata="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" path="m2456942,l,,,12496r2456942,l2456942,xe" fillcolor="black" stroked="f">
+                      <v:shape id="Graphic 16" ns10:spid="_x0000_s1028" style="position:absolute;left:123;top:1;width:24574;height:127;visibility:visible;mso-wrap-style:square;v-text-anchor:top" coordsize="2457450,12700" ns10:gfxdata="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" path="m2456942,l,,,12496r2456942,l2456942,xe" fillcolor="black" stroked="f">
                         <v:path arrowok="t"/>
                       </v:shape>
-                      <v:shape id="Graphic 17" o:spid="_x0000_s1029" style="position:absolute;left:8;top:8;width:13;height:1956;visibility:visible;mso-wrap-style:square;v-text-anchor:top" coordsize="1270,195580" o:gfxdata="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" path="m,l,195376e" filled="f" strokeweight=".14pt">
+                      <v:shape id="Graphic 17" ns10:spid="_x0000_s1029" style="position:absolute;left:8;top:8;width:13;height:1956;visibility:visible;mso-wrap-style:square;v-text-anchor:top" coordsize="1270,195580" ns10:gfxdata="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" path="m,l,195376e" filled="f" strokeweight=".14pt">
                         <v:path arrowok="t"/>
                       </v:shape>
-                      <v:shape id="Graphic 18" o:spid="_x0000_s1030" style="position:absolute;left:1;top:1;width:127;height:1975;visibility:visible;mso-wrap-style:square;v-text-anchor:top" coordsize="12700,197485" o:gfxdata="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" path="m12191,l,,,196900r12191,l12191,xe" fillcolor="black" stroked="f">
+                      <v:shape id="Graphic 18" ns10:spid="_x0000_s1030" style="position:absolute;left:1;top:1;width:127;height:1975;visibility:visible;mso-wrap-style:square;v-text-anchor:top" coordsize="12700,197485" ns10:gfxdata="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" path="m12191,l,,,196900r12191,l12191,xe" fillcolor="black" stroked="f">
                         <v:path arrowok="t"/>
                       </v:shape>
-                      <v:shape id="Graphic 19" o:spid="_x0000_s1031" style="position:absolute;left:130;top:1855;width:24556;height:13;visibility:visible;mso-wrap-style:square;v-text-anchor:top" coordsize="2455545,1270" o:gfxdata="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" path="m,l2455417,e" filled="f" strokeweight=".14pt">
+                      <v:shape id="Graphic 19" ns10:spid="_x0000_s1031" style="position:absolute;left:130;top:1855;width:24556;height:13;visibility:visible;mso-wrap-style:square;v-text-anchor:top" coordsize="2455545,1270" ns10:gfxdata="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" path="m,l2455417,e" filled="f" strokeweight=".14pt">
                         <v:path arrowok="t"/>
                       </v:shape>
-                      <v:shape id="Graphic 20" o:spid="_x0000_s1032" style="position:absolute;left:123;top:1848;width:24574;height:127;visibility:visible;mso-wrap-style:square;v-text-anchor:top" coordsize="2457450,12700" o:gfxdata="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" path="m2456942,l,,,12191r2456942,l2456942,xe" fillcolor="black" stroked="f">
+                      <v:shape id="Graphic 20" ns10:spid="_x0000_s1032" style="position:absolute;left:123;top:1848;width:24574;height:127;visibility:visible;mso-wrap-style:square;v-text-anchor:top" coordsize="2457450,12700" ns10:gfxdata="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" path="m2456942,l,,,12191r2456942,l2456942,xe" fillcolor="black" stroked="f">
                         <v:path arrowok="t"/>
                       </v:shape>
-                      <v:shape id="Graphic 21" o:spid="_x0000_s1033" style="position:absolute;left:24578;top:133;width:13;height:1829;visibility:visible;mso-wrap-style:square;v-text-anchor:top" coordsize="1270,182880" o:gfxdata="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" path="m,l,182880e" filled="f" strokeweight=".14pt">
+                      <v:shape id="Graphic 21" ns10:spid="_x0000_s1033" style="position:absolute;left:24578;top:133;width:13;height:1829;visibility:visible;mso-wrap-style:square;v-text-anchor:top" coordsize="1270,182880" ns10:gfxdata="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" path="m,l,182880e" filled="f" strokeweight=".14pt">
                         <v:path arrowok="t"/>
                       </v:shape>
-                      <v:shape id="Graphic 22" o:spid="_x0000_s1034" style="position:absolute;left:24570;top:126;width:127;height:1848;visibility:visible;mso-wrap-style:square;v-text-anchor:top" coordsize="12700,184785" o:gfxdata="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" path="m12191,l,,,184404r12191,l12191,xe" fillcolor="black" stroked="f">
+                      <v:shape id="Graphic 22" ns10:spid="_x0000_s1034" style="position:absolute;left:24570;top:126;width:127;height:1848;visibility:visible;mso-wrap-style:square;v-text-anchor:top" coordsize="12700,184785" ns10:gfxdata="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" path="m12191,l,,,184404r12191,l12191,xe" fillcolor="black" stroked="f">
                         <v:path arrowok="t"/>
                       </v:shape>
                     </v:group>
@@ -4968,138 +4962,138 @@
               <w:rPr>
                 <w:sz w:val="12"/>
               </w:rPr>
-              <w:t>*</w:t>
+              <w:t>* Exempted for E-way Bill vide Notf. No. 03/2018 Central Tax clause 14(e)</w:t>
             </w:r>
             <w:r>
               <w:rPr>
                 <w:spacing w:val="-5"/>
                 <w:sz w:val="12"/>
               </w:rPr>
-              <w:t xml:space="preserve"> </w:t>
+              <w:t xml:space="preserve"/>
             </w:r>
             <w:r>
               <w:rPr>
                 <w:sz w:val="12"/>
               </w:rPr>
-              <w:t>GST</w:t>
+              <w:t/>
             </w:r>
             <w:r>
               <w:rPr>
                 <w:spacing w:val="-5"/>
                 <w:sz w:val="12"/>
               </w:rPr>
-              <w:t xml:space="preserve"> </w:t>
+              <w:t xml:space="preserve"/>
             </w:r>
             <w:r>
               <w:rPr>
                 <w:sz w:val="12"/>
               </w:rPr>
-              <w:t>under</w:t>
+              <w:t/>
             </w:r>
             <w:r>
               <w:rPr>
                 <w:spacing w:val="-5"/>
                 <w:sz w:val="12"/>
               </w:rPr>
-              <w:t xml:space="preserve"> </w:t>
+              <w:t xml:space="preserve"/>
             </w:r>
             <w:r>
               <w:rPr>
                 <w:sz w:val="12"/>
               </w:rPr>
-              <w:t>rcm</w:t>
+              <w:t/>
             </w:r>
             <w:r>
               <w:rPr>
                 <w:spacing w:val="-4"/>
                 <w:sz w:val="12"/>
               </w:rPr>
-              <w:t xml:space="preserve"> </w:t>
+              <w:t xml:space="preserve"/>
             </w:r>
             <w:r>
               <w:rPr>
                 <w:sz w:val="12"/>
               </w:rPr>
-              <w:t>is</w:t>
+              <w:t/>
             </w:r>
             <w:r>
               <w:rPr>
                 <w:spacing w:val="-3"/>
                 <w:sz w:val="12"/>
               </w:rPr>
-              <w:t xml:space="preserve"> </w:t>
+              <w:t xml:space="preserve"/>
             </w:r>
             <w:r>
               <w:rPr>
                 <w:sz w:val="12"/>
               </w:rPr>
-              <w:t>not</w:t>
+              <w:t/>
             </w:r>
             <w:r>
               <w:rPr>
                 <w:spacing w:val="-4"/>
                 <w:sz w:val="12"/>
               </w:rPr>
-              <w:t xml:space="preserve"> </w:t>
+              <w:t xml:space="preserve"/>
             </w:r>
             <w:r>
               <w:rPr>
                 <w:sz w:val="12"/>
               </w:rPr>
-              <w:t>applicable</w:t>
+              <w:t/>
             </w:r>
             <w:r>
               <w:rPr>
                 <w:spacing w:val="-4"/>
                 <w:sz w:val="12"/>
               </w:rPr>
-              <w:t xml:space="preserve"> </w:t>
+              <w:t xml:space="preserve"/>
             </w:r>
             <w:r>
               <w:rPr>
                 <w:sz w:val="12"/>
               </w:rPr>
-              <w:t>for</w:t>
+              <w:t/>
             </w:r>
             <w:r>
               <w:rPr>
                 <w:spacing w:val="-5"/>
                 <w:sz w:val="12"/>
               </w:rPr>
-              <w:t xml:space="preserve"> </w:t>
+              <w:t xml:space="preserve"/>
             </w:r>
             <w:r>
               <w:rPr>
                 <w:sz w:val="12"/>
               </w:rPr>
-              <w:t>outward</w:t>
+              <w:t/>
             </w:r>
             <w:r>
               <w:rPr>
                 <w:spacing w:val="-5"/>
                 <w:sz w:val="12"/>
               </w:rPr>
-              <w:t xml:space="preserve"> </w:t>
+              <w:t xml:space="preserve"/>
             </w:r>
             <w:r>
               <w:rPr>
                 <w:sz w:val="12"/>
               </w:rPr>
-              <w:t>expmted</w:t>
+              <w:t/>
             </w:r>
             <w:r>
               <w:rPr>
                 <w:spacing w:val="-5"/>
                 <w:sz w:val="12"/>
               </w:rPr>
-              <w:t xml:space="preserve"> </w:t>
+              <w:t xml:space="preserve"/>
             </w:r>
             <w:r>
               <w:rPr>
                 <w:spacing w:val="-2"/>
                 <w:sz w:val="12"/>
               </w:rPr>
-              <w:t>supply</w:t>
+              <w:t/>
             </w:r>
           </w:p>
           <w:p>
@@ -5313,7 +5307,7 @@
                 <w:b/>
                 <w:sz w:val="16"/>
               </w:rPr>
-              <w:t>SECUNDERABAD</w:t>
+              <w:t>SANGAREDDY</w:t>
             </w:r>
             <w:r>
               <w:rPr>
@@ -5417,7 +5411,7 @@
         <mc:AlternateContent>
           <mc:Choice Requires="wps">
             <w:drawing>
-              <wp:anchor distT="0" distB="0" distL="0" distR="0" simplePos="0" relativeHeight="15730176" behindDoc="0" locked="0" layoutInCell="1" allowOverlap="1" wp14:anchorId="2BADA328" wp14:editId="3F590329">
+              <wp:anchor distT="0" distB="0" distL="0" distR="0" simplePos="0" relativeHeight="15730176" behindDoc="0" locked="0" layoutInCell="1" allowOverlap="1" ns4:anchorId="2BADA328" ns4:editId="3F590329">
                 <wp:simplePos x="0" y="0"/>
                 <wp:positionH relativeFrom="page">
                   <wp:posOffset>3155188</wp:posOffset>
@@ -5430,15 +5424,15 @@
                 <wp:wrapNone/>
                 <wp:docPr id="23" name="Textbox 23"/>
                 <wp:cNvGraphicFramePr>
-                  <a:graphicFrameLocks xmlns:a="http://schemas.openxmlformats.org/drawingml/2006/main"/>
+                  <a:graphicFrameLocks/>
                 </wp:cNvGraphicFramePr>
-                <a:graphic xmlns:a="http://schemas.openxmlformats.org/drawingml/2006/main">
+                <a:graphic>
                   <a:graphicData uri="http://schemas.microsoft.com/office/word/2010/wordprocessingShape">
-                    <wps:wsp>
-                      <wps:cNvSpPr txBox="1">
+                    <ns11:wsp>
+                      <ns11:cNvSpPr txBox="1">
                         <a:spLocks/>
-                      </wps:cNvSpPr>
-                      <wps:spPr>
+                      </ns11:cNvSpPr>
+                      <ns11:spPr>
                         <a:xfrm>
                           <a:off x="0" y="0"/>
                           <a:ext cx="3734435" cy="759460"/>
@@ -5446,8 +5440,8 @@
                         <a:prstGeom prst="rect">
                           <a:avLst/>
                         </a:prstGeom>
-                      </wps:spPr>
-                      <wps:txbx>
+                      </ns11:spPr>
+                      <ns11:txbx>
                         <w:txbxContent>
                           <w:tbl>
                             <w:tblPr>
@@ -5542,11 +5536,11 @@
                           </w:tbl>
                           <w:p/>
                         </w:txbxContent>
-                      </wps:txbx>
-                      <wps:bodyPr wrap="square" lIns="0" tIns="0" rIns="0" bIns="0" rtlCol="0">
+                      </ns11:txbx>
+                      <ns11:bodyPr wrap="square" lIns="0" tIns="0" rIns="0" bIns="0" rtlCol="0">
                         <a:noAutofit/>
-                      </wps:bodyPr>
-                    </wps:wsp>
+                      </ns11:bodyPr>
+                    </ns11:wsp>
                   </a:graphicData>
                 </a:graphic>
               </wp:anchor>
@@ -5554,11 +5548,11 @@
           </mc:Choice>
           <mc:Fallback>
             <w:pict>
-              <v:shapetype w14:anchorId="2BADA328" id="_x0000_t202" coordsize="21600,21600" o:spt="202" path="m,l,21600r21600,l21600,xe">
+              <v:shapetype w14:anchorId="2BADA328" id="_x0000_t202" coordsize="21600,21600" ns10:spt="202" path="m,l,21600r21600,l21600,xe">
                 <v:stroke joinstyle="miter"/>
-                <v:path gradientshapeok="t" o:connecttype="rect"/>
+                <v:path gradientshapeok="t" ns10:connecttype="rect"/>
               </v:shapetype>
-              <v:shape id="Textbox 23" o:spid="_x0000_s1026" type="#_x0000_t202" style="position:absolute;margin-left:248.45pt;margin-top:48.35pt;width:294.05pt;height:59.8pt;z-index:15730176;visibility:visible;mso-wrap-style:square;mso-wrap-distance-left:0;mso-wrap-distance-top:0;mso-wrap-distance-right:0;mso-wrap-distance-bottom:0;mso-position-horizontal:absolute;mso-position-horizontal-relative:page;mso-position-vertical:absolute;mso-position-vertical-relative:page;v-text-anchor:top" o:gfxdata="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" filled="f" stroked="f">
+              <v:shape id="Textbox 23" ns10:spid="_x0000_s1026" type="#_x0000_t202" style="position:absolute;margin-left:248.45pt;margin-top:48.35pt;width:294.05pt;height:59.8pt;z-index:15730176;visibility:visible;mso-wrap-style:square;mso-wrap-distance-left:0;mso-wrap-distance-top:0;mso-wrap-distance-right:0;mso-wrap-distance-bottom:0;mso-position-horizontal:absolute;mso-position-horizontal-relative:page;mso-position-vertical:absolute;mso-position-vertical-relative:page;v-text-anchor:top" ns10:gfxdata="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" filled="f" stroked="f">
                 <v:textbox inset="0,0,0,0">
                   <w:txbxContent>
                     <w:tbl>
@@ -5655,7 +5649,7 @@
                     <w:p/>
                   </w:txbxContent>
                 </v:textbox>
-                <w10:wrap anchorx="page" anchory="page"/>
+                <ns12:wrap anchorx="page" anchory="page"/>
               </v:shape>
             </w:pict>
           </mc:Fallback>

</xml_diff>

<commit_message>
Fix PDF download layout, ensure complete footer and add official SR logo
</commit_message>
<xml_diff>
--- a/11048.docx
+++ b/11048.docx
@@ -1,6 +1,6 @@
 
 <file path=word/document.xml><?xml version="1.0" encoding="utf-8"?>
-<w:document xmlns:a="http://schemas.openxmlformats.org/drawingml/2006/main" xmlns:mc="http://schemas.openxmlformats.org/markup-compatibility/2006" xmlns:ns10="urn:schemas-microsoft-com:office:office" xmlns:ns11="http://schemas.microsoft.com/office/word/2010/wordprocessingShape" xmlns:ns12="urn:schemas-microsoft-com:office:word" xmlns:ns4="http://schemas.microsoft.com/office/word/2010/wordprocessingDrawing" xmlns:pic="http://schemas.openxmlformats.org/drawingml/2006/picture" xmlns:r="http://schemas.openxmlformats.org/officeDocument/2006/relationships" xmlns:v="urn:schemas-microsoft-com:vml" xmlns:w="http://schemas.openxmlformats.org/wordprocessingml/2006/main" xmlns:w14="http://schemas.microsoft.com/office/word/2010/wordml" xmlns:wp="http://schemas.openxmlformats.org/drawingml/2006/wordprocessingDrawing" xmlns:wpg="http://schemas.microsoft.com/office/word/2010/wordprocessingGroup" mc:Ignorable="w14 w15 w16se w16cid w16 w16cex w16sdtdh w16sdtfl w16du wp14">
+<w:document xmlns:wpc="http://schemas.microsoft.com/office/word/2010/wordprocessingCanvas" xmlns:cx="http://schemas.microsoft.com/office/drawing/2014/chartex" xmlns:cx1="http://schemas.microsoft.com/office/drawing/2015/9/8/chartex" xmlns:cx2="http://schemas.microsoft.com/office/drawing/2015/10/21/chartex" xmlns:cx3="http://schemas.microsoft.com/office/drawing/2016/5/9/chartex" xmlns:cx4="http://schemas.microsoft.com/office/drawing/2016/5/10/chartex" xmlns:cx5="http://schemas.microsoft.com/office/drawing/2016/5/11/chartex" xmlns:cx6="http://schemas.microsoft.com/office/drawing/2016/5/12/chartex" xmlns:cx7="http://schemas.microsoft.com/office/drawing/2016/5/13/chartex" xmlns:cx8="http://schemas.microsoft.com/office/drawing/2016/5/14/chartex" xmlns:mc="http://schemas.openxmlformats.org/markup-compatibility/2006" xmlns:aink="http://schemas.microsoft.com/office/drawing/2016/ink" xmlns:am3d="http://schemas.microsoft.com/office/drawing/2017/model3d" xmlns:o="urn:schemas-microsoft-com:office:office" xmlns:oel="http://schemas.microsoft.com/office/2019/extlst" xmlns:r="http://schemas.openxmlformats.org/officeDocument/2006/relationships" xmlns:m="http://schemas.openxmlformats.org/officeDocument/2006/math" xmlns:v="urn:schemas-microsoft-com:vml" xmlns:wp14="http://schemas.microsoft.com/office/word/2010/wordprocessingDrawing" xmlns:wp="http://schemas.openxmlformats.org/drawingml/2006/wordprocessingDrawing" xmlns:w10="urn:schemas-microsoft-com:office:word" xmlns:w="http://schemas.openxmlformats.org/wordprocessingml/2006/main" xmlns:w14="http://schemas.microsoft.com/office/word/2010/wordml" xmlns:w15="http://schemas.microsoft.com/office/word/2012/wordml" xmlns:w16cex="http://schemas.microsoft.com/office/word/2018/wordml/cex" xmlns:w16cid="http://schemas.microsoft.com/office/word/2016/wordml/cid" xmlns:w16="http://schemas.microsoft.com/office/word/2018/wordml" xmlns:w16du="http://schemas.microsoft.com/office/word/2023/wordml/word16du" xmlns:w16sdtdh="http://schemas.microsoft.com/office/word/2020/wordml/sdtdatahash" xmlns:w16sdtfl="http://schemas.microsoft.com/office/word/2024/wordml/sdtformatlock" xmlns:w16se="http://schemas.microsoft.com/office/word/2015/wordml/symex" xmlns:wpg="http://schemas.microsoft.com/office/word/2010/wordprocessingGroup" xmlns:wpi="http://schemas.microsoft.com/office/word/2010/wordprocessingInk" xmlns:wne="http://schemas.microsoft.com/office/word/2006/wordml" xmlns:wps="http://schemas.microsoft.com/office/word/2010/wordprocessingShape" mc:Ignorable="w14 w15 w16se w16cid w16 w16cex w16sdtdh w16sdtfl w16du wp14">
   <w:body>
     <w:tbl>
       <w:tblPr>
@@ -112,7 +112,7 @@
               <mc:AlternateContent>
                 <mc:Choice Requires="wpg">
                   <w:drawing>
-                    <wp:anchor distT="0" distB="0" distL="0" distR="0" simplePos="0" relativeHeight="487419904" behindDoc="1" locked="0" layoutInCell="1" allowOverlap="1" ns4:anchorId="43ED93BA" ns4:editId="0C4919D2">
+                    <wp:anchor distT="0" distB="0" distL="0" distR="0" simplePos="0" relativeHeight="487419904" behindDoc="1" locked="0" layoutInCell="1" allowOverlap="1" wp14:anchorId="43ED93BA" wp14:editId="0C4919D2">
                       <wp:simplePos x="0" y="0"/>
                       <wp:positionH relativeFrom="column">
                         <wp:posOffset>1671827</wp:posOffset>
@@ -125,9 +125,9 @@
                       <wp:wrapNone/>
                       <wp:docPr id="1" name="Group 1"/>
                       <wp:cNvGraphicFramePr>
-                        <a:graphicFrameLocks/>
+                        <a:graphicFrameLocks xmlns:a="http://schemas.openxmlformats.org/drawingml/2006/main"/>
                       </wp:cNvGraphicFramePr>
-                      <a:graphic>
+                      <a:graphic xmlns:a="http://schemas.openxmlformats.org/drawingml/2006/main">
                         <a:graphicData uri="http://schemas.microsoft.com/office/word/2010/wordprocessingGroup">
                           <wpg:wgp>
                             <wpg:cNvGrpSpPr>
@@ -141,7 +141,7 @@
                                 <a:chExt cx="1320165" cy="771525"/>
                               </a:xfrm>
                             </wpg:grpSpPr>
-                            <pic:pic>
+                            <pic:pic xmlns:pic="http://schemas.openxmlformats.org/drawingml/2006/picture">
                               <pic:nvPicPr>
                                 <pic:cNvPr id="2" name="Image 2"/>
                                 <pic:cNvPicPr/>
@@ -170,8 +170,8 @@
                 </mc:Choice>
                 <mc:Fallback>
                   <w:pict>
-                    <v:group w14:anchorId="3274F24C" id="Group 1" ns10:spid="_x0000_s1026" style="position:absolute;margin-left:131.65pt;margin-top:11.8pt;width:103.95pt;height:60.75pt;z-index:-15896576;mso-wrap-distance-left:0;mso-wrap-distance-right:0" coordsize="13201,7715" ns10:gfxdata="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">
-                      <v:shapetype id="_x0000_t75" coordsize="21600,21600" ns10:spt="75" ns10:preferrelative="t" path="m@4@5l@4@11@9@11@9@5xe" filled="f" stroked="f">
+                    <v:group w14:anchorId="3274F24C" id="Group 1" o:spid="_x0000_s1026" style="position:absolute;margin-left:131.65pt;margin-top:11.8pt;width:103.95pt;height:60.75pt;z-index:-15896576;mso-wrap-distance-left:0;mso-wrap-distance-right:0" coordsize="13201,7715" o:gfxdata="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">
+                      <v:shapetype id="_x0000_t75" coordsize="21600,21600" o:spt="75" o:preferrelative="t" path="m@4@5l@4@11@9@11@9@5xe" filled="f" stroked="f">
                         <v:stroke joinstyle="miter"/>
                         <v:formulas>
                           <v:f eqn="if lineDrawn pixelLineWidth 0"/>
@@ -187,11 +187,11 @@
                           <v:f eqn="prod @7 21600 pixelHeight"/>
                           <v:f eqn="sum @10 21600 0"/>
                         </v:formulas>
-                        <v:path ns10:extrusionok="f" gradientshapeok="t" ns10:connecttype="rect"/>
-                        <ns10:lock v:ext="edit" aspectratio="t"/>
+                        <v:path o:extrusionok="f" gradientshapeok="t" o:connecttype="rect"/>
+                        <o:lock v:ext="edit" aspectratio="t"/>
                       </v:shapetype>
-                      <v:shape id="Image 2" ns10:spid="_x0000_s1027" type="#_x0000_t75" style="position:absolute;width:13146;height:7680;visibility:visible;mso-wrap-style:square" ns10:gfxdata="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">
-                        <v:imagedata r:id="rId5" ns10:title=""/>
+                      <v:shape id="Image 2" o:spid="_x0000_s1027" type="#_x0000_t75" style="position:absolute;width:13146;height:7680;visibility:visible;mso-wrap-style:square" o:gfxdata="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">
+                        <v:imagedata r:id="rId5" o:title=""/>
                       </v:shape>
                     </v:group>
                   </w:pict>
@@ -204,7 +204,7 @@
                 <w:b/>
                 <w:sz w:val="28"/>
               </w:rPr>
-              <w:t>SR TRANSPORT</w:t>
+              <w:t>SR</w:t>
             </w:r>
             <w:r>
               <w:rPr>
@@ -213,7 +213,7 @@
                 <w:spacing w:val="-10"/>
                 <w:sz w:val="28"/>
               </w:rPr>
-              <w:t xml:space="preserve"/>
+              <w:t xml:space="preserve"> </w:t>
             </w:r>
             <w:r>
               <w:rPr>
@@ -221,7 +221,7 @@
                 <w:b/>
                 <w:sz w:val="28"/>
               </w:rPr>
-              <w:t/>
+              <w:t>Trans</w:t>
             </w:r>
             <w:r>
               <w:rPr>
@@ -230,7 +230,7 @@
                 <w:spacing w:val="-9"/>
                 <w:sz w:val="28"/>
               </w:rPr>
-              <w:t xml:space="preserve"/>
+              <w:t xml:space="preserve"> </w:t>
             </w:r>
             <w:r>
               <w:rPr>
@@ -238,7 +238,7 @@
                 <w:b/>
                 <w:sz w:val="28"/>
               </w:rPr>
-              <w:t/>
+              <w:t>and</w:t>
             </w:r>
             <w:r>
               <w:rPr>
@@ -247,7 +247,7 @@
                 <w:spacing w:val="-9"/>
                 <w:sz w:val="28"/>
               </w:rPr>
-              <w:t xml:space="preserve"/>
+              <w:t xml:space="preserve"> </w:t>
             </w:r>
             <w:r>
               <w:rPr>
@@ -255,7 +255,7 @@
                 <w:b/>
                 <w:sz w:val="28"/>
               </w:rPr>
-              <w:t/>
+              <w:t>Trade</w:t>
             </w:r>
             <w:r>
               <w:rPr>
@@ -264,7 +264,7 @@
                 <w:spacing w:val="-8"/>
                 <w:sz w:val="28"/>
               </w:rPr>
-              <w:t xml:space="preserve"/>
+              <w:t xml:space="preserve"> </w:t>
             </w:r>
             <w:r>
               <w:rPr>
@@ -272,7 +272,7 @@
                 <w:b/>
                 <w:sz w:val="28"/>
               </w:rPr>
-              <w:t/>
+              <w:t>India</w:t>
             </w:r>
             <w:r>
               <w:rPr>
@@ -281,7 +281,7 @@
                 <w:spacing w:val="-9"/>
                 <w:sz w:val="28"/>
               </w:rPr>
-              <w:t xml:space="preserve"/>
+              <w:t xml:space="preserve"> </w:t>
             </w:r>
             <w:r>
               <w:rPr>
@@ -289,7 +289,7 @@
                 <w:b/>
                 <w:sz w:val="28"/>
               </w:rPr>
-              <w:t/>
+              <w:t>Private</w:t>
             </w:r>
             <w:r>
               <w:rPr>
@@ -298,7 +298,7 @@
                 <w:spacing w:val="-7"/>
                 <w:sz w:val="28"/>
               </w:rPr>
-              <w:t xml:space="preserve"/>
+              <w:t xml:space="preserve"> </w:t>
             </w:r>
             <w:r>
               <w:rPr>
@@ -307,7 +307,7 @@
                 <w:spacing w:val="-2"/>
                 <w:sz w:val="28"/>
               </w:rPr>
-              <w:t/>
+              <w:t>Limited</w:t>
             </w:r>
           </w:p>
           <w:p>
@@ -323,85 +323,85 @@
               <w:rPr>
                 <w:sz w:val="20"/>
               </w:rPr>
-              <w:t>Plot No. 341, Sai Bhagavan Colony, Beeramguda, R.C. Puram, Hyderabad - 502032</w:t>
+              <w:t>1-2-597/36</w:t>
             </w:r>
             <w:r>
               <w:rPr>
                 <w:spacing w:val="-10"/>
                 <w:sz w:val="20"/>
               </w:rPr>
-              <w:t xml:space="preserve"/>
-            </w:r>
-            <w:r>
-              <w:rPr>
-                <w:sz w:val="20"/>
-              </w:rPr>
-              <w:t/>
+              <w:t xml:space="preserve"> </w:t>
+            </w:r>
+            <w:r>
+              <w:rPr>
+                <w:sz w:val="20"/>
+              </w:rPr>
+              <w:t>to</w:t>
             </w:r>
             <w:r>
               <w:rPr>
                 <w:spacing w:val="-9"/>
                 <w:sz w:val="20"/>
               </w:rPr>
-              <w:t xml:space="preserve"/>
-            </w:r>
-            <w:r>
-              <w:rPr>
-                <w:sz w:val="20"/>
-              </w:rPr>
-              <w:t/>
+              <w:t xml:space="preserve"> </w:t>
+            </w:r>
+            <w:r>
+              <w:rPr>
+                <w:sz w:val="20"/>
+              </w:rPr>
+              <w:t>41,</w:t>
             </w:r>
             <w:r>
               <w:rPr>
                 <w:spacing w:val="-9"/>
                 <w:sz w:val="20"/>
               </w:rPr>
-              <w:t xml:space="preserve"/>
-            </w:r>
-            <w:r>
-              <w:rPr>
-                <w:sz w:val="20"/>
-              </w:rPr>
-              <w:t/>
+              <w:t xml:space="preserve"> </w:t>
+            </w:r>
+            <w:r>
+              <w:rPr>
+                <w:sz w:val="20"/>
+              </w:rPr>
+              <w:t>SVSS</w:t>
             </w:r>
             <w:r>
               <w:rPr>
                 <w:spacing w:val="-10"/>
                 <w:sz w:val="20"/>
               </w:rPr>
-              <w:t xml:space="preserve"/>
-            </w:r>
-            <w:r>
-              <w:rPr>
-                <w:sz w:val="20"/>
-              </w:rPr>
-              <w:t/>
+              <w:t xml:space="preserve"> </w:t>
+            </w:r>
+            <w:r>
+              <w:rPr>
+                <w:sz w:val="20"/>
+              </w:rPr>
+              <w:t>SANKALP</w:t>
             </w:r>
             <w:r>
               <w:rPr>
                 <w:spacing w:val="-9"/>
                 <w:sz w:val="20"/>
               </w:rPr>
-              <w:t xml:space="preserve"/>
-            </w:r>
-            <w:r>
-              <w:rPr>
-                <w:sz w:val="20"/>
-              </w:rPr>
-              <w:t/>
+              <w:t xml:space="preserve"> </w:t>
+            </w:r>
+            <w:r>
+              <w:rPr>
+                <w:sz w:val="20"/>
+              </w:rPr>
+              <w:t>Apts,</w:t>
             </w:r>
             <w:r>
               <w:rPr>
                 <w:spacing w:val="-9"/>
                 <w:sz w:val="20"/>
               </w:rPr>
-              <w:t xml:space="preserve"/>
-            </w:r>
-            <w:r>
-              <w:rPr>
-                <w:sz w:val="20"/>
-              </w:rPr>
-              <w:t/>
+              <w:t xml:space="preserve"> </w:t>
+            </w:r>
+            <w:r>
+              <w:rPr>
+                <w:sz w:val="20"/>
+              </w:rPr>
+              <w:t>C-303 LOWER TANK BUND, HYDERABAD-500 080</w:t>
             </w:r>
           </w:p>
           <w:p>
@@ -450,21 +450,21 @@
               <w:rPr>
                 <w:sz w:val="20"/>
               </w:rPr>
-              <w:t/>
+              <w:t>+91</w:t>
             </w:r>
             <w:r>
               <w:rPr>
                 <w:spacing w:val="-4"/>
                 <w:sz w:val="20"/>
               </w:rPr>
-              <w:t xml:space="preserve"/>
+              <w:t xml:space="preserve"> </w:t>
             </w:r>
             <w:r>
               <w:rPr>
                 <w:spacing w:val="-2"/>
                 <w:sz w:val="20"/>
               </w:rPr>
-              <w:t> 9704527762 / 9010578128 / 9966818478</w:t>
+              <w:t>9704527762</w:t>
             </w:r>
             <w:r>
               <w:rPr>
@@ -3407,7 +3407,7 @@
               <mc:AlternateContent>
                 <mc:Choice Requires="wpg">
                   <w:drawing>
-                    <wp:anchor distT="0" distB="0" distL="0" distR="0" simplePos="0" relativeHeight="15730688" behindDoc="0" locked="0" layoutInCell="1" allowOverlap="1" ns4:anchorId="6B703932" ns4:editId="4B4F1DF0">
+                    <wp:anchor distT="0" distB="0" distL="0" distR="0" simplePos="0" relativeHeight="15730688" behindDoc="0" locked="0" layoutInCell="1" allowOverlap="1" wp14:anchorId="6B703932" wp14:editId="4B4F1DF0">
                       <wp:simplePos x="0" y="0"/>
                       <wp:positionH relativeFrom="column">
                         <wp:posOffset>7720583</wp:posOffset>
@@ -3420,9 +3420,9 @@
                       <wp:wrapNone/>
                       <wp:docPr id="3" name="Group 3"/>
                       <wp:cNvGraphicFramePr>
-                        <a:graphicFrameLocks/>
+                        <a:graphicFrameLocks xmlns:a="http://schemas.openxmlformats.org/drawingml/2006/main"/>
                       </wp:cNvGraphicFramePr>
-                      <a:graphic>
+                      <a:graphic xmlns:a="http://schemas.openxmlformats.org/drawingml/2006/main">
                         <a:graphicData uri="http://schemas.microsoft.com/office/word/2010/wordprocessingGroup">
                           <wpg:wgp>
                             <wpg:cNvGrpSpPr>
@@ -3436,7 +3436,7 @@
                                 <a:chExt cx="811530" cy="815975"/>
                               </a:xfrm>
                             </wpg:grpSpPr>
-                            <pic:pic>
+                            <pic:pic xmlns:pic="http://schemas.openxmlformats.org/drawingml/2006/picture">
                               <pic:nvPicPr>
                                 <pic:cNvPr id="4" name="Image 4"/>
                                 <pic:cNvPicPr/>
@@ -3465,9 +3465,9 @@
                 </mc:Choice>
                 <mc:Fallback>
                   <w:pict>
-                    <v:group w14:anchorId="1A93BF2F" id="Group 3" ns10:spid="_x0000_s1026" style="position:absolute;margin-left:607.9pt;margin-top:34.65pt;width:63.9pt;height:64.25pt;z-index:15730688;mso-wrap-distance-left:0;mso-wrap-distance-right:0" coordsize="8115,8159" ns10:gfxdata="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">
-                      <v:shape id="Image 4" ns10:spid="_x0000_s1027" type="#_x0000_t75" style="position:absolute;width:8114;height:8154;visibility:visible;mso-wrap-style:square" ns10:gfxdata="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">
-                        <v:imagedata r:id="rId8" ns10:title=""/>
+                    <v:group w14:anchorId="1A93BF2F" id="Group 3" o:spid="_x0000_s1026" style="position:absolute;margin-left:607.9pt;margin-top:34.65pt;width:63.9pt;height:64.25pt;z-index:15730688;mso-wrap-distance-left:0;mso-wrap-distance-right:0" coordsize="8115,8159" o:gfxdata="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">
+                      <v:shape id="Image 4" o:spid="_x0000_s1027" type="#_x0000_t75" style="position:absolute;width:8114;height:8154;visibility:visible;mso-wrap-style:square" o:gfxdata="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">
+                        <v:imagedata r:id="rId8" o:title=""/>
                       </v:shape>
                     </v:group>
                   </w:pict>
@@ -3494,7 +3494,7 @@
                 <w:b/>
                 <w:sz w:val="18"/>
               </w:rPr>
-              <w:t>SR TRANSPORT</w:t>
+              <w:t>SR</w:t>
             </w:r>
             <w:r>
               <w:rPr>
@@ -3502,14 +3502,14 @@
                 <w:spacing w:val="-3"/>
                 <w:sz w:val="18"/>
               </w:rPr>
-              <w:t xml:space="preserve"/>
-            </w:r>
-            <w:r>
-              <w:rPr>
-                <w:b/>
-                <w:sz w:val="18"/>
-              </w:rPr>
-              <w:t/>
+              <w:t xml:space="preserve"> </w:t>
+            </w:r>
+            <w:r>
+              <w:rPr>
+                <w:b/>
+                <w:sz w:val="18"/>
+              </w:rPr>
+              <w:t>Trans</w:t>
             </w:r>
             <w:r>
               <w:rPr>
@@ -3517,14 +3517,14 @@
                 <w:spacing w:val="-2"/>
                 <w:sz w:val="18"/>
               </w:rPr>
-              <w:t xml:space="preserve"/>
-            </w:r>
-            <w:r>
-              <w:rPr>
-                <w:b/>
-                <w:sz w:val="18"/>
-              </w:rPr>
-              <w:t/>
+              <w:t xml:space="preserve"> </w:t>
+            </w:r>
+            <w:r>
+              <w:rPr>
+                <w:b/>
+                <w:sz w:val="18"/>
+              </w:rPr>
+              <w:t>and</w:t>
             </w:r>
             <w:r>
               <w:rPr>
@@ -3532,14 +3532,14 @@
                 <w:spacing w:val="-5"/>
                 <w:sz w:val="18"/>
               </w:rPr>
-              <w:t xml:space="preserve"/>
-            </w:r>
-            <w:r>
-              <w:rPr>
-                <w:b/>
-                <w:sz w:val="18"/>
-              </w:rPr>
-              <w:t/>
+              <w:t xml:space="preserve"> </w:t>
+            </w:r>
+            <w:r>
+              <w:rPr>
+                <w:b/>
+                <w:sz w:val="18"/>
+              </w:rPr>
+              <w:t>Trade</w:t>
             </w:r>
             <w:r>
               <w:rPr>
@@ -3547,14 +3547,14 @@
                 <w:spacing w:val="-2"/>
                 <w:sz w:val="18"/>
               </w:rPr>
-              <w:t xml:space="preserve"/>
-            </w:r>
-            <w:r>
-              <w:rPr>
-                <w:b/>
-                <w:sz w:val="18"/>
-              </w:rPr>
-              <w:t/>
+              <w:t xml:space="preserve"> </w:t>
+            </w:r>
+            <w:r>
+              <w:rPr>
+                <w:b/>
+                <w:sz w:val="18"/>
+              </w:rPr>
+              <w:t>India</w:t>
             </w:r>
             <w:r>
               <w:rPr>
@@ -3562,14 +3562,14 @@
                 <w:spacing w:val="-2"/>
                 <w:sz w:val="18"/>
               </w:rPr>
-              <w:t xml:space="preserve"/>
-            </w:r>
-            <w:r>
-              <w:rPr>
-                <w:b/>
-                <w:sz w:val="18"/>
-              </w:rPr>
-              <w:t/>
+              <w:t xml:space="preserve"> </w:t>
+            </w:r>
+            <w:r>
+              <w:rPr>
+                <w:b/>
+                <w:sz w:val="18"/>
+              </w:rPr>
+              <w:t>Private</w:t>
             </w:r>
             <w:r>
               <w:rPr>
@@ -3577,7 +3577,7 @@
                 <w:spacing w:val="-2"/>
                 <w:sz w:val="18"/>
               </w:rPr>
-              <w:t xml:space="preserve"/>
+              <w:t xml:space="preserve"> Limited</w:t>
             </w:r>
           </w:p>
           <w:p>
@@ -3599,7 +3599,7 @@
               <mc:AlternateContent>
                 <mc:Choice Requires="wpg">
                   <w:drawing>
-                    <wp:anchor distT="0" distB="0" distL="0" distR="0" simplePos="0" relativeHeight="487418880" behindDoc="1" locked="0" layoutInCell="1" allowOverlap="1" ns4:anchorId="353C53E2" ns4:editId="666ADAD1">
+                    <wp:anchor distT="0" distB="0" distL="0" distR="0" simplePos="0" relativeHeight="487418880" behindDoc="1" locked="0" layoutInCell="1" allowOverlap="1" wp14:anchorId="353C53E2" wp14:editId="666ADAD1">
                       <wp:simplePos x="0" y="0"/>
                       <wp:positionH relativeFrom="column">
                         <wp:posOffset>4055871</wp:posOffset>
@@ -3612,9 +3612,9 @@
                       <wp:wrapNone/>
                       <wp:docPr id="5" name="Group 5"/>
                       <wp:cNvGraphicFramePr>
-                        <a:graphicFrameLocks/>
+                        <a:graphicFrameLocks xmlns:a="http://schemas.openxmlformats.org/drawingml/2006/main"/>
                       </wp:cNvGraphicFramePr>
-                      <a:graphic>
+                      <a:graphic xmlns:a="http://schemas.openxmlformats.org/drawingml/2006/main">
                         <a:graphicData uri="http://schemas.microsoft.com/office/word/2010/wordprocessingGroup">
                           <wpg:wgp>
                             <wpg:cNvGrpSpPr>
@@ -3628,10 +3628,10 @@
                                 <a:chExt cx="2469515" cy="934719"/>
                               </a:xfrm>
                             </wpg:grpSpPr>
-                            <ns11:wsp>
-                              <ns11:cNvPr id="6" name="Graphic 6"/>
-                              <ns11:cNvSpPr/>
-                              <ns11:spPr>
+                            <wps:wsp>
+                              <wps:cNvPr id="6" name="Graphic 6"/>
+                              <wps:cNvSpPr/>
+                              <wps:spPr>
                                 <a:xfrm>
                                   <a:off x="13080" y="889"/>
                                   <a:ext cx="2455545" cy="1270"/>
@@ -3659,18 +3659,18 @@
                                   </a:solidFill>
                                   <a:prstDash val="solid"/>
                                 </a:ln>
-                              </ns11:spPr>
-                              <ns11:bodyPr wrap="square" lIns="0" tIns="0" rIns="0" bIns="0" rtlCol="0">
+                              </wps:spPr>
+                              <wps:bodyPr wrap="square" lIns="0" tIns="0" rIns="0" bIns="0" rtlCol="0">
                                 <a:prstTxWarp prst="textNoShape">
                                   <a:avLst/>
                                 </a:prstTxWarp>
                                 <a:noAutofit/>
-                              </ns11:bodyPr>
-                            </ns11:wsp>
-                            <ns11:wsp>
-                              <ns11:cNvPr id="7" name="Graphic 7"/>
-                              <ns11:cNvSpPr/>
-                              <ns11:spPr>
+                              </wps:bodyPr>
+                            </wps:wsp>
+                            <wps:wsp>
+                              <wps:cNvPr id="7" name="Graphic 7"/>
+                              <wps:cNvSpPr/>
+                              <wps:spPr>
                                 <a:xfrm>
                                   <a:off x="12319" y="127"/>
                                   <a:ext cx="2457450" cy="12700"/>
@@ -3705,18 +3705,18 @@
                                 <a:solidFill>
                                   <a:srgbClr val="000000"/>
                                 </a:solidFill>
-                              </ns11:spPr>
-                              <ns11:bodyPr wrap="square" lIns="0" tIns="0" rIns="0" bIns="0" rtlCol="0">
+                              </wps:spPr>
+                              <wps:bodyPr wrap="square" lIns="0" tIns="0" rIns="0" bIns="0" rtlCol="0">
                                 <a:prstTxWarp prst="textNoShape">
                                   <a:avLst/>
                                 </a:prstTxWarp>
                                 <a:noAutofit/>
-                              </ns11:bodyPr>
-                            </ns11:wsp>
-                            <ns11:wsp>
-                              <ns11:cNvPr id="8" name="Graphic 8"/>
-                              <ns11:cNvSpPr/>
-                              <ns11:spPr>
+                              </wps:bodyPr>
+                            </wps:wsp>
+                            <wps:wsp>
+                              <wps:cNvPr id="8" name="Graphic 8"/>
+                              <wps:cNvSpPr/>
+                              <wps:spPr>
                                 <a:xfrm>
                                   <a:off x="889" y="889"/>
                                   <a:ext cx="1270" cy="932815"/>
@@ -3744,18 +3744,18 @@
                                   </a:solidFill>
                                   <a:prstDash val="solid"/>
                                 </a:ln>
-                              </ns11:spPr>
-                              <ns11:bodyPr wrap="square" lIns="0" tIns="0" rIns="0" bIns="0" rtlCol="0">
+                              </wps:spPr>
+                              <wps:bodyPr wrap="square" lIns="0" tIns="0" rIns="0" bIns="0" rtlCol="0">
                                 <a:prstTxWarp prst="textNoShape">
                                   <a:avLst/>
                                 </a:prstTxWarp>
                                 <a:noAutofit/>
-                              </ns11:bodyPr>
-                            </ns11:wsp>
-                            <ns11:wsp>
-                              <ns11:cNvPr id="9" name="Graphic 9"/>
-                              <ns11:cNvSpPr/>
-                              <ns11:spPr>
+                              </wps:bodyPr>
+                            </wps:wsp>
+                            <wps:wsp>
+                              <wps:cNvPr id="9" name="Graphic 9"/>
+                              <wps:cNvSpPr/>
+                              <wps:spPr>
                                 <a:xfrm>
                                   <a:off x="126" y="126"/>
                                   <a:ext cx="12700" cy="934719"/>
@@ -3790,18 +3790,18 @@
                                 <a:solidFill>
                                   <a:srgbClr val="000000"/>
                                 </a:solidFill>
-                              </ns11:spPr>
-                              <ns11:bodyPr wrap="square" lIns="0" tIns="0" rIns="0" bIns="0" rtlCol="0">
+                              </wps:spPr>
+                              <wps:bodyPr wrap="square" lIns="0" tIns="0" rIns="0" bIns="0" rtlCol="0">
                                 <a:prstTxWarp prst="textNoShape">
                                   <a:avLst/>
                                 </a:prstTxWarp>
                                 <a:noAutofit/>
-                              </ns11:bodyPr>
-                            </ns11:wsp>
-                            <ns11:wsp>
-                              <ns11:cNvPr id="10" name="Graphic 10"/>
-                              <ns11:cNvSpPr/>
-                              <ns11:spPr>
+                              </wps:bodyPr>
+                            </wps:wsp>
+                            <wps:wsp>
+                              <wps:cNvPr id="10" name="Graphic 10"/>
+                              <wps:cNvSpPr/>
+                              <wps:spPr>
                                 <a:xfrm>
                                   <a:off x="13080" y="922908"/>
                                   <a:ext cx="2455545" cy="1270"/>
@@ -3829,18 +3829,18 @@
                                   </a:solidFill>
                                   <a:prstDash val="solid"/>
                                 </a:ln>
-                              </ns11:spPr>
-                              <ns11:bodyPr wrap="square" lIns="0" tIns="0" rIns="0" bIns="0" rtlCol="0">
+                              </wps:spPr>
+                              <wps:bodyPr wrap="square" lIns="0" tIns="0" rIns="0" bIns="0" rtlCol="0">
                                 <a:prstTxWarp prst="textNoShape">
                                   <a:avLst/>
                                 </a:prstTxWarp>
                                 <a:noAutofit/>
-                              </ns11:bodyPr>
-                            </ns11:wsp>
-                            <ns11:wsp>
-                              <ns11:cNvPr id="11" name="Graphic 11"/>
-                              <ns11:cNvSpPr/>
-                              <ns11:spPr>
+                              </wps:bodyPr>
+                            </wps:wsp>
+                            <wps:wsp>
+                              <wps:cNvPr id="11" name="Graphic 11"/>
+                              <wps:cNvSpPr/>
+                              <wps:spPr>
                                 <a:xfrm>
                                   <a:off x="12319" y="922147"/>
                                   <a:ext cx="2457450" cy="12700"/>
@@ -3875,18 +3875,18 @@
                                 <a:solidFill>
                                   <a:srgbClr val="000000"/>
                                 </a:solidFill>
-                              </ns11:spPr>
-                              <ns11:bodyPr wrap="square" lIns="0" tIns="0" rIns="0" bIns="0" rtlCol="0">
+                              </wps:spPr>
+                              <wps:bodyPr wrap="square" lIns="0" tIns="0" rIns="0" bIns="0" rtlCol="0">
                                 <a:prstTxWarp prst="textNoShape">
                                   <a:avLst/>
                                 </a:prstTxWarp>
                                 <a:noAutofit/>
-                              </ns11:bodyPr>
-                            </ns11:wsp>
-                            <ns11:wsp>
-                              <ns11:cNvPr id="12" name="Graphic 12"/>
-                              <ns11:cNvSpPr/>
-                              <ns11:spPr>
+                              </wps:bodyPr>
+                            </wps:wsp>
+                            <wps:wsp>
+                              <wps:cNvPr id="12" name="Graphic 12"/>
+                              <wps:cNvSpPr/>
+                              <wps:spPr>
                                 <a:xfrm>
                                   <a:off x="2457830" y="13080"/>
                                   <a:ext cx="1270" cy="920750"/>
@@ -3914,18 +3914,18 @@
                                   </a:solidFill>
                                   <a:prstDash val="solid"/>
                                 </a:ln>
-                              </ns11:spPr>
-                              <ns11:bodyPr wrap="square" lIns="0" tIns="0" rIns="0" bIns="0" rtlCol="0">
+                              </wps:spPr>
+                              <wps:bodyPr wrap="square" lIns="0" tIns="0" rIns="0" bIns="0" rtlCol="0">
                                 <a:prstTxWarp prst="textNoShape">
                                   <a:avLst/>
                                 </a:prstTxWarp>
                                 <a:noAutofit/>
-                              </ns11:bodyPr>
-                            </ns11:wsp>
-                            <ns11:wsp>
-                              <ns11:cNvPr id="13" name="Graphic 13"/>
-                              <ns11:cNvSpPr/>
-                              <ns11:spPr>
+                              </wps:bodyPr>
+                            </wps:wsp>
+                            <wps:wsp>
+                              <wps:cNvPr id="13" name="Graphic 13"/>
+                              <wps:cNvSpPr/>
+                              <wps:spPr>
                                 <a:xfrm>
                                   <a:off x="2457069" y="12319"/>
                                   <a:ext cx="12700" cy="922019"/>
@@ -3960,14 +3960,14 @@
                                 <a:solidFill>
                                   <a:srgbClr val="000000"/>
                                 </a:solidFill>
-                              </ns11:spPr>
-                              <ns11:bodyPr wrap="square" lIns="0" tIns="0" rIns="0" bIns="0" rtlCol="0">
+                              </wps:spPr>
+                              <wps:bodyPr wrap="square" lIns="0" tIns="0" rIns="0" bIns="0" rtlCol="0">
                                 <a:prstTxWarp prst="textNoShape">
                                   <a:avLst/>
                                 </a:prstTxWarp>
                                 <a:noAutofit/>
-                              </ns11:bodyPr>
-                            </ns11:wsp>
+                              </wps:bodyPr>
+                            </wps:wsp>
                           </wpg:wgp>
                         </a:graphicData>
                       </a:graphic>
@@ -3976,29 +3976,29 @@
                 </mc:Choice>
                 <mc:Fallback>
                   <w:pict>
-                    <v:group w14:anchorId="60CFAB14" id="Group 5" ns10:spid="_x0000_s1026" style="position:absolute;margin-left:319.35pt;margin-top:.7pt;width:194.45pt;height:73.6pt;z-index:-15897600;mso-wrap-distance-left:0;mso-wrap-distance-right:0" coordsize="24695,9347" ns10:gfxdata="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">
-                      <v:shape id="Graphic 6" ns10:spid="_x0000_s1027" style="position:absolute;left:130;top:8;width:24556;height:13;visibility:visible;mso-wrap-style:square;v-text-anchor:top" coordsize="2455545,1270" ns10:gfxdata="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" path="m,l2455417,e" filled="f" strokeweight=".14pt">
+                    <v:group w14:anchorId="60CFAB14" id="Group 5" o:spid="_x0000_s1026" style="position:absolute;margin-left:319.35pt;margin-top:.7pt;width:194.45pt;height:73.6pt;z-index:-15897600;mso-wrap-distance-left:0;mso-wrap-distance-right:0" coordsize="24695,9347" o:gfxdata="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">
+                      <v:shape id="Graphic 6" o:spid="_x0000_s1027" style="position:absolute;left:130;top:8;width:24556;height:13;visibility:visible;mso-wrap-style:square;v-text-anchor:top" coordsize="2455545,1270" o:gfxdata="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" path="m,l2455417,e" filled="f" strokeweight=".14pt">
                         <v:path arrowok="t"/>
                       </v:shape>
-                      <v:shape id="Graphic 7" ns10:spid="_x0000_s1028" style="position:absolute;left:123;top:1;width:24574;height:127;visibility:visible;mso-wrap-style:square;v-text-anchor:top" coordsize="2457450,12700" ns10:gfxdata="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" path="m2456942,l,,,12191r2456942,l2456942,xe" fillcolor="black" stroked="f">
+                      <v:shape id="Graphic 7" o:spid="_x0000_s1028" style="position:absolute;left:123;top:1;width:24574;height:127;visibility:visible;mso-wrap-style:square;v-text-anchor:top" coordsize="2457450,12700" o:gfxdata="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" path="m2456942,l,,,12191r2456942,l2456942,xe" fillcolor="black" stroked="f">
                         <v:path arrowok="t"/>
                       </v:shape>
-                      <v:shape id="Graphic 8" ns10:spid="_x0000_s1029" style="position:absolute;left:8;top:8;width:13;height:9329;visibility:visible;mso-wrap-style:square;v-text-anchor:top" coordsize="1270,932815" ns10:gfxdata="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" path="m,l,932687e" filled="f" strokeweight=".14pt">
+                      <v:shape id="Graphic 8" o:spid="_x0000_s1029" style="position:absolute;left:8;top:8;width:13;height:9329;visibility:visible;mso-wrap-style:square;v-text-anchor:top" coordsize="1270,932815" o:gfxdata="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" path="m,l,932687e" filled="f" strokeweight=".14pt">
                         <v:path arrowok="t"/>
                       </v:shape>
-                      <v:shape id="Graphic 9" ns10:spid="_x0000_s1030" style="position:absolute;left:1;top:1;width:127;height:9347;visibility:visible;mso-wrap-style:square;v-text-anchor:top" coordsize="12700,934719" ns10:gfxdata="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" path="m12191,l,,,934212r12191,l12191,xe" fillcolor="black" stroked="f">
+                      <v:shape id="Graphic 9" o:spid="_x0000_s1030" style="position:absolute;left:1;top:1;width:127;height:9347;visibility:visible;mso-wrap-style:square;v-text-anchor:top" coordsize="12700,934719" o:gfxdata="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" path="m12191,l,,,934212r12191,l12191,xe" fillcolor="black" stroked="f">
                         <v:path arrowok="t"/>
                       </v:shape>
-                      <v:shape id="Graphic 10" ns10:spid="_x0000_s1031" style="position:absolute;left:130;top:9229;width:24556;height:12;visibility:visible;mso-wrap-style:square;v-text-anchor:top" coordsize="2455545,1270" ns10:gfxdata="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" path="m,l2455417,e" filled="f" strokeweight=".14pt">
+                      <v:shape id="Graphic 10" o:spid="_x0000_s1031" style="position:absolute;left:130;top:9229;width:24556;height:12;visibility:visible;mso-wrap-style:square;v-text-anchor:top" coordsize="2455545,1270" o:gfxdata="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" path="m,l2455417,e" filled="f" strokeweight=".14pt">
                         <v:path arrowok="t"/>
                       </v:shape>
-                      <v:shape id="Graphic 11" ns10:spid="_x0000_s1032" style="position:absolute;left:123;top:9221;width:24574;height:127;visibility:visible;mso-wrap-style:square;v-text-anchor:top" coordsize="2457450,12700" ns10:gfxdata="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" path="m2456942,l,,,12191r2456942,l2456942,xe" fillcolor="black" stroked="f">
+                      <v:shape id="Graphic 11" o:spid="_x0000_s1032" style="position:absolute;left:123;top:9221;width:24574;height:127;visibility:visible;mso-wrap-style:square;v-text-anchor:top" coordsize="2457450,12700" o:gfxdata="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" path="m2456942,l,,,12191r2456942,l2456942,xe" fillcolor="black" stroked="f">
                         <v:path arrowok="t"/>
                       </v:shape>
-                      <v:shape id="Graphic 12" ns10:spid="_x0000_s1033" style="position:absolute;left:24578;top:130;width:13;height:9208;visibility:visible;mso-wrap-style:square;v-text-anchor:top" coordsize="1270,920750" ns10:gfxdata="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" path="m,l,920495e" filled="f" strokeweight=".14pt">
+                      <v:shape id="Graphic 12" o:spid="_x0000_s1033" style="position:absolute;left:24578;top:130;width:13;height:9208;visibility:visible;mso-wrap-style:square;v-text-anchor:top" coordsize="1270,920750" o:gfxdata="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" path="m,l,920495e" filled="f" strokeweight=".14pt">
                         <v:path arrowok="t"/>
                       </v:shape>
-                      <v:shape id="Graphic 13" ns10:spid="_x0000_s1034" style="position:absolute;left:24570;top:123;width:127;height:9220;visibility:visible;mso-wrap-style:square;v-text-anchor:top" coordsize="12700,922019" ns10:gfxdata="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" path="m12191,l,,,922019r12191,l12191,xe" fillcolor="black" stroked="f">
+                      <v:shape id="Graphic 13" o:spid="_x0000_s1034" style="position:absolute;left:24570;top:123;width:127;height:9220;visibility:visible;mso-wrap-style:square;v-text-anchor:top" coordsize="12700,922019" o:gfxdata="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" path="m12191,l,,,922019r12191,l12191,xe" fillcolor="black" stroked="f">
                         <v:path arrowok="t"/>
                       </v:shape>
                     </v:group>
@@ -4220,7 +4220,7 @@
                 <w:b/>
                 <w:sz w:val="16"/>
               </w:rPr>
-              <w:t>Reg No:</w:t>
+              <w:t>GSTIN:</w:t>
             </w:r>
             <w:r>
               <w:rPr>
@@ -4228,7 +4228,7 @@
                 <w:spacing w:val="-2"/>
                 <w:sz w:val="16"/>
               </w:rPr>
-              <w:t xml:space="preserve"> SEA/SAN/ALO/PC/0607538/2023</w:t>
+              <w:t xml:space="preserve"> 36ELKPK3812H1ZP</w:t>
             </w:r>
             <w:r>
               <w:rPr>
@@ -4347,27 +4347,27 @@
                 <w:sz w:val="18"/>
               </w:rPr>
               <w:tab/>
-              <w:t>Chandanagar</w:t>
+              <w:t>Sarojini</w:t>
             </w:r>
             <w:r>
               <w:rPr>
                 <w:spacing w:val="-8"/>
                 <w:sz w:val="18"/>
               </w:rPr>
-              <w:t xml:space="preserve"/>
-            </w:r>
-            <w:r>
-              <w:rPr>
-                <w:sz w:val="18"/>
-              </w:rPr>
-              <w:t/>
+              <w:t xml:space="preserve"> </w:t>
+            </w:r>
+            <w:r>
+              <w:rPr>
+                <w:sz w:val="18"/>
+              </w:rPr>
+              <w:t>Devi</w:t>
             </w:r>
             <w:r>
               <w:rPr>
                 <w:spacing w:val="-4"/>
                 <w:sz w:val="18"/>
               </w:rPr>
-              <w:t xml:space="preserve"/>
+              <w:t xml:space="preserve"> Road</w:t>
             </w:r>
             <w:r>
               <w:rPr>
@@ -4418,7 +4418,7 @@
                 <w:b/>
                 <w:sz w:val="16"/>
               </w:rPr>
-              <w:t>Udyam:</w:t>
+              <w:t>CIN:</w:t>
             </w:r>
             <w:r>
               <w:rPr>
@@ -4492,7 +4492,7 @@
                 <w:b/>
                 <w:sz w:val="16"/>
               </w:rPr>
-              <w:t>* GST to be paid by Service Recipient</w:t>
+              <w:t>Udyam</w:t>
             </w:r>
             <w:r>
               <w:rPr>
@@ -4500,14 +4500,14 @@
                 <w:spacing w:val="-6"/>
                 <w:sz w:val="16"/>
               </w:rPr>
-              <w:t xml:space="preserve"/>
+              <w:t xml:space="preserve"> </w:t>
             </w:r>
             <w:r>
               <w:rPr>
                 <w:b/>
                 <w:sz w:val="16"/>
               </w:rPr>
-              <w:t/>
+              <w:t>Certificate:</w:t>
             </w:r>
             <w:r>
               <w:rPr>
@@ -4515,14 +4515,14 @@
                 <w:spacing w:val="-6"/>
                 <w:sz w:val="16"/>
               </w:rPr>
-              <w:t xml:space="preserve"/>
+              <w:t xml:space="preserve"> </w:t>
             </w:r>
             <w:r>
               <w:rPr>
                 <w:b/>
                 <w:sz w:val="16"/>
               </w:rPr>
-              <w:t/>
+              <w:t>UDYAM-TS-02-</w:t>
             </w:r>
             <w:r>
               <w:rPr>
@@ -4530,7 +4530,7 @@
                 <w:spacing w:val="-2"/>
                 <w:sz w:val="16"/>
               </w:rPr>
-              <w:t/>
+              <w:t>0048963</w:t>
             </w:r>
           </w:p>
           <w:p>
@@ -4551,7 +4551,7 @@
               <mc:AlternateContent>
                 <mc:Choice Requires="wpg">
                   <w:drawing>
-                    <wp:anchor distT="0" distB="0" distL="0" distR="0" simplePos="0" relativeHeight="487419392" behindDoc="1" locked="0" layoutInCell="1" allowOverlap="1" ns4:anchorId="2C597C56" ns4:editId="0003C51D">
+                    <wp:anchor distT="0" distB="0" distL="0" distR="0" simplePos="0" relativeHeight="487419392" behindDoc="1" locked="0" layoutInCell="1" allowOverlap="1" wp14:anchorId="2C597C56" wp14:editId="0003C51D">
                       <wp:simplePos x="0" y="0"/>
                       <wp:positionH relativeFrom="column">
                         <wp:posOffset>4055871</wp:posOffset>
@@ -4564,9 +4564,9 @@
                       <wp:wrapNone/>
                       <wp:docPr id="14" name="Group 14"/>
                       <wp:cNvGraphicFramePr>
-                        <a:graphicFrameLocks/>
+                        <a:graphicFrameLocks xmlns:a="http://schemas.openxmlformats.org/drawingml/2006/main"/>
                       </wp:cNvGraphicFramePr>
-                      <a:graphic>
+                      <a:graphic xmlns:a="http://schemas.openxmlformats.org/drawingml/2006/main">
                         <a:graphicData uri="http://schemas.microsoft.com/office/word/2010/wordprocessingGroup">
                           <wpg:wgp>
                             <wpg:cNvGrpSpPr>
@@ -4580,10 +4580,10 @@
                                 <a:chExt cx="2469515" cy="197485"/>
                               </a:xfrm>
                             </wpg:grpSpPr>
-                            <ns11:wsp>
-                              <ns11:cNvPr id="15" name="Graphic 15"/>
-                              <ns11:cNvSpPr/>
-                              <ns11:spPr>
+                            <wps:wsp>
+                              <wps:cNvPr id="15" name="Graphic 15"/>
+                              <wps:cNvSpPr/>
+                              <wps:spPr>
                                 <a:xfrm>
                                   <a:off x="13080" y="889"/>
                                   <a:ext cx="2455545" cy="1270"/>
@@ -4611,18 +4611,18 @@
                                   </a:solidFill>
                                   <a:prstDash val="solid"/>
                                 </a:ln>
-                              </ns11:spPr>
-                              <ns11:bodyPr wrap="square" lIns="0" tIns="0" rIns="0" bIns="0" rtlCol="0">
+                              </wps:spPr>
+                              <wps:bodyPr wrap="square" lIns="0" tIns="0" rIns="0" bIns="0" rtlCol="0">
                                 <a:prstTxWarp prst="textNoShape">
                                   <a:avLst/>
                                 </a:prstTxWarp>
                                 <a:noAutofit/>
-                              </ns11:bodyPr>
-                            </ns11:wsp>
-                            <ns11:wsp>
-                              <ns11:cNvPr id="16" name="Graphic 16"/>
-                              <ns11:cNvSpPr/>
-                              <ns11:spPr>
+                              </wps:bodyPr>
+                            </wps:wsp>
+                            <wps:wsp>
+                              <wps:cNvPr id="16" name="Graphic 16"/>
+                              <wps:cNvSpPr/>
+                              <wps:spPr>
                                 <a:xfrm>
                                   <a:off x="12319" y="126"/>
                                   <a:ext cx="2457450" cy="12700"/>
@@ -4657,18 +4657,18 @@
                                 <a:solidFill>
                                   <a:srgbClr val="000000"/>
                                 </a:solidFill>
-                              </ns11:spPr>
-                              <ns11:bodyPr wrap="square" lIns="0" tIns="0" rIns="0" bIns="0" rtlCol="0">
+                              </wps:spPr>
+                              <wps:bodyPr wrap="square" lIns="0" tIns="0" rIns="0" bIns="0" rtlCol="0">
                                 <a:prstTxWarp prst="textNoShape">
                                   <a:avLst/>
                                 </a:prstTxWarp>
                                 <a:noAutofit/>
-                              </ns11:bodyPr>
-                            </ns11:wsp>
-                            <ns11:wsp>
-                              <ns11:cNvPr id="17" name="Graphic 17"/>
-                              <ns11:cNvSpPr/>
-                              <ns11:spPr>
+                              </wps:bodyPr>
+                            </wps:wsp>
+                            <wps:wsp>
+                              <wps:cNvPr id="17" name="Graphic 17"/>
+                              <wps:cNvSpPr/>
+                              <wps:spPr>
                                 <a:xfrm>
                                   <a:off x="889" y="889"/>
                                   <a:ext cx="1270" cy="195580"/>
@@ -4696,18 +4696,18 @@
                                   </a:solidFill>
                                   <a:prstDash val="solid"/>
                                 </a:ln>
-                              </ns11:spPr>
-                              <ns11:bodyPr wrap="square" lIns="0" tIns="0" rIns="0" bIns="0" rtlCol="0">
+                              </wps:spPr>
+                              <wps:bodyPr wrap="square" lIns="0" tIns="0" rIns="0" bIns="0" rtlCol="0">
                                 <a:prstTxWarp prst="textNoShape">
                                   <a:avLst/>
                                 </a:prstTxWarp>
                                 <a:noAutofit/>
-                              </ns11:bodyPr>
-                            </ns11:wsp>
-                            <ns11:wsp>
-                              <ns11:cNvPr id="18" name="Graphic 18"/>
-                              <ns11:cNvSpPr/>
-                              <ns11:spPr>
+                              </wps:bodyPr>
+                            </wps:wsp>
+                            <wps:wsp>
+                              <wps:cNvPr id="18" name="Graphic 18"/>
+                              <wps:cNvSpPr/>
+                              <wps:spPr>
                                 <a:xfrm>
                                   <a:off x="126" y="126"/>
                                   <a:ext cx="12700" cy="197485"/>
@@ -4742,18 +4742,18 @@
                                 <a:solidFill>
                                   <a:srgbClr val="000000"/>
                                 </a:solidFill>
-                              </ns11:spPr>
-                              <ns11:bodyPr wrap="square" lIns="0" tIns="0" rIns="0" bIns="0" rtlCol="0">
+                              </wps:spPr>
+                              <wps:bodyPr wrap="square" lIns="0" tIns="0" rIns="0" bIns="0" rtlCol="0">
                                 <a:prstTxWarp prst="textNoShape">
                                   <a:avLst/>
                                 </a:prstTxWarp>
                                 <a:noAutofit/>
-                              </ns11:bodyPr>
-                            </ns11:wsp>
-                            <ns11:wsp>
-                              <ns11:cNvPr id="19" name="Graphic 19"/>
-                              <ns11:cNvSpPr/>
-                              <ns11:spPr>
+                              </wps:bodyPr>
+                            </wps:wsp>
+                            <wps:wsp>
+                              <wps:cNvPr id="19" name="Graphic 19"/>
+                              <wps:cNvSpPr/>
+                              <wps:spPr>
                                 <a:xfrm>
                                   <a:off x="13080" y="185597"/>
                                   <a:ext cx="2455545" cy="1270"/>
@@ -4781,18 +4781,18 @@
                                   </a:solidFill>
                                   <a:prstDash val="solid"/>
                                 </a:ln>
-                              </ns11:spPr>
-                              <ns11:bodyPr wrap="square" lIns="0" tIns="0" rIns="0" bIns="0" rtlCol="0">
+                              </wps:spPr>
+                              <wps:bodyPr wrap="square" lIns="0" tIns="0" rIns="0" bIns="0" rtlCol="0">
                                 <a:prstTxWarp prst="textNoShape">
                                   <a:avLst/>
                                 </a:prstTxWarp>
                                 <a:noAutofit/>
-                              </ns11:bodyPr>
-                            </ns11:wsp>
-                            <ns11:wsp>
-                              <ns11:cNvPr id="20" name="Graphic 20"/>
-                              <ns11:cNvSpPr/>
-                              <ns11:spPr>
+                              </wps:bodyPr>
+                            </wps:wsp>
+                            <wps:wsp>
+                              <wps:cNvPr id="20" name="Graphic 20"/>
+                              <wps:cNvSpPr/>
+                              <wps:spPr>
                                 <a:xfrm>
                                   <a:off x="12319" y="184836"/>
                                   <a:ext cx="2457450" cy="12700"/>
@@ -4827,18 +4827,18 @@
                                 <a:solidFill>
                                   <a:srgbClr val="000000"/>
                                 </a:solidFill>
-                              </ns11:spPr>
-                              <ns11:bodyPr wrap="square" lIns="0" tIns="0" rIns="0" bIns="0" rtlCol="0">
+                              </wps:spPr>
+                              <wps:bodyPr wrap="square" lIns="0" tIns="0" rIns="0" bIns="0" rtlCol="0">
                                 <a:prstTxWarp prst="textNoShape">
                                   <a:avLst/>
                                 </a:prstTxWarp>
                                 <a:noAutofit/>
-                              </ns11:bodyPr>
-                            </ns11:wsp>
-                            <ns11:wsp>
-                              <ns11:cNvPr id="21" name="Graphic 21"/>
-                              <ns11:cNvSpPr/>
-                              <ns11:spPr>
+                              </wps:bodyPr>
+                            </wps:wsp>
+                            <wps:wsp>
+                              <wps:cNvPr id="21" name="Graphic 21"/>
+                              <wps:cNvSpPr/>
+                              <wps:spPr>
                                 <a:xfrm>
                                   <a:off x="2457830" y="13385"/>
                                   <a:ext cx="1270" cy="182880"/>
@@ -4866,18 +4866,18 @@
                                   </a:solidFill>
                                   <a:prstDash val="solid"/>
                                 </a:ln>
-                              </ns11:spPr>
-                              <ns11:bodyPr wrap="square" lIns="0" tIns="0" rIns="0" bIns="0" rtlCol="0">
+                              </wps:spPr>
+                              <wps:bodyPr wrap="square" lIns="0" tIns="0" rIns="0" bIns="0" rtlCol="0">
                                 <a:prstTxWarp prst="textNoShape">
                                   <a:avLst/>
                                 </a:prstTxWarp>
                                 <a:noAutofit/>
-                              </ns11:bodyPr>
-                            </ns11:wsp>
-                            <ns11:wsp>
-                              <ns11:cNvPr id="22" name="Graphic 22"/>
-                              <ns11:cNvSpPr/>
-                              <ns11:spPr>
+                              </wps:bodyPr>
+                            </wps:wsp>
+                            <wps:wsp>
+                              <wps:cNvPr id="22" name="Graphic 22"/>
+                              <wps:cNvSpPr/>
+                              <wps:spPr>
                                 <a:xfrm>
                                   <a:off x="2457069" y="12623"/>
                                   <a:ext cx="12700" cy="184785"/>
@@ -4912,14 +4912,14 @@
                                 <a:solidFill>
                                   <a:srgbClr val="000000"/>
                                 </a:solidFill>
-                              </ns11:spPr>
-                              <ns11:bodyPr wrap="square" lIns="0" tIns="0" rIns="0" bIns="0" rtlCol="0">
+                              </wps:spPr>
+                              <wps:bodyPr wrap="square" lIns="0" tIns="0" rIns="0" bIns="0" rtlCol="0">
                                 <a:prstTxWarp prst="textNoShape">
                                   <a:avLst/>
                                 </a:prstTxWarp>
                                 <a:noAutofit/>
-                              </ns11:bodyPr>
-                            </ns11:wsp>
+                              </wps:bodyPr>
+                            </wps:wsp>
                           </wpg:wgp>
                         </a:graphicData>
                       </a:graphic>
@@ -4928,29 +4928,29 @@
                 </mc:Choice>
                 <mc:Fallback>
                   <w:pict>
-                    <v:group w14:anchorId="32688C6B" id="Group 14" ns10:spid="_x0000_s1026" style="position:absolute;margin-left:319.35pt;margin-top:1pt;width:194.45pt;height:15.55pt;z-index:-15897088;mso-wrap-distance-left:0;mso-wrap-distance-right:0" coordsize="24695,1974" ns10:gfxdata="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">
-                      <v:shape id="Graphic 15" ns10:spid="_x0000_s1027" style="position:absolute;left:130;top:8;width:24556;height:13;visibility:visible;mso-wrap-style:square;v-text-anchor:top" coordsize="2455545,1270" ns10:gfxdata="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" path="m,l2455417,e" filled="f" strokeweight=".14pt">
+                    <v:group w14:anchorId="32688C6B" id="Group 14" o:spid="_x0000_s1026" style="position:absolute;margin-left:319.35pt;margin-top:1pt;width:194.45pt;height:15.55pt;z-index:-15897088;mso-wrap-distance-left:0;mso-wrap-distance-right:0" coordsize="24695,1974" o:gfxdata="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">
+                      <v:shape id="Graphic 15" o:spid="_x0000_s1027" style="position:absolute;left:130;top:8;width:24556;height:13;visibility:visible;mso-wrap-style:square;v-text-anchor:top" coordsize="2455545,1270" o:gfxdata="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" path="m,l2455417,e" filled="f" strokeweight=".14pt">
                         <v:path arrowok="t"/>
                       </v:shape>
-                      <v:shape id="Graphic 16" ns10:spid="_x0000_s1028" style="position:absolute;left:123;top:1;width:24574;height:127;visibility:visible;mso-wrap-style:square;v-text-anchor:top" coordsize="2457450,12700" ns10:gfxdata="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" path="m2456942,l,,,12496r2456942,l2456942,xe" fillcolor="black" stroked="f">
+                      <v:shape id="Graphic 16" o:spid="_x0000_s1028" style="position:absolute;left:123;top:1;width:24574;height:127;visibility:visible;mso-wrap-style:square;v-text-anchor:top" coordsize="2457450,12700" o:gfxdata="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" path="m2456942,l,,,12496r2456942,l2456942,xe" fillcolor="black" stroked="f">
                         <v:path arrowok="t"/>
                       </v:shape>
-                      <v:shape id="Graphic 17" ns10:spid="_x0000_s1029" style="position:absolute;left:8;top:8;width:13;height:1956;visibility:visible;mso-wrap-style:square;v-text-anchor:top" coordsize="1270,195580" ns10:gfxdata="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" path="m,l,195376e" filled="f" strokeweight=".14pt">
+                      <v:shape id="Graphic 17" o:spid="_x0000_s1029" style="position:absolute;left:8;top:8;width:13;height:1956;visibility:visible;mso-wrap-style:square;v-text-anchor:top" coordsize="1270,195580" o:gfxdata="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" path="m,l,195376e" filled="f" strokeweight=".14pt">
                         <v:path arrowok="t"/>
                       </v:shape>
-                      <v:shape id="Graphic 18" ns10:spid="_x0000_s1030" style="position:absolute;left:1;top:1;width:127;height:1975;visibility:visible;mso-wrap-style:square;v-text-anchor:top" coordsize="12700,197485" ns10:gfxdata="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" path="m12191,l,,,196900r12191,l12191,xe" fillcolor="black" stroked="f">
+                      <v:shape id="Graphic 18" o:spid="_x0000_s1030" style="position:absolute;left:1;top:1;width:127;height:1975;visibility:visible;mso-wrap-style:square;v-text-anchor:top" coordsize="12700,197485" o:gfxdata="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" path="m12191,l,,,196900r12191,l12191,xe" fillcolor="black" stroked="f">
                         <v:path arrowok="t"/>
                       </v:shape>
-                      <v:shape id="Graphic 19" ns10:spid="_x0000_s1031" style="position:absolute;left:130;top:1855;width:24556;height:13;visibility:visible;mso-wrap-style:square;v-text-anchor:top" coordsize="2455545,1270" ns10:gfxdata="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" path="m,l2455417,e" filled="f" strokeweight=".14pt">
+                      <v:shape id="Graphic 19" o:spid="_x0000_s1031" style="position:absolute;left:130;top:1855;width:24556;height:13;visibility:visible;mso-wrap-style:square;v-text-anchor:top" coordsize="2455545,1270" o:gfxdata="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" path="m,l2455417,e" filled="f" strokeweight=".14pt">
                         <v:path arrowok="t"/>
                       </v:shape>
-                      <v:shape id="Graphic 20" ns10:spid="_x0000_s1032" style="position:absolute;left:123;top:1848;width:24574;height:127;visibility:visible;mso-wrap-style:square;v-text-anchor:top" coordsize="2457450,12700" ns10:gfxdata="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" path="m2456942,l,,,12191r2456942,l2456942,xe" fillcolor="black" stroked="f">
+                      <v:shape id="Graphic 20" o:spid="_x0000_s1032" style="position:absolute;left:123;top:1848;width:24574;height:127;visibility:visible;mso-wrap-style:square;v-text-anchor:top" coordsize="2457450,12700" o:gfxdata="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" path="m2456942,l,,,12191r2456942,l2456942,xe" fillcolor="black" stroked="f">
                         <v:path arrowok="t"/>
                       </v:shape>
-                      <v:shape id="Graphic 21" ns10:spid="_x0000_s1033" style="position:absolute;left:24578;top:133;width:13;height:1829;visibility:visible;mso-wrap-style:square;v-text-anchor:top" coordsize="1270,182880" ns10:gfxdata="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" path="m,l,182880e" filled="f" strokeweight=".14pt">
+                      <v:shape id="Graphic 21" o:spid="_x0000_s1033" style="position:absolute;left:24578;top:133;width:13;height:1829;visibility:visible;mso-wrap-style:square;v-text-anchor:top" coordsize="1270,182880" o:gfxdata="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" path="m,l,182880e" filled="f" strokeweight=".14pt">
                         <v:path arrowok="t"/>
                       </v:shape>
-                      <v:shape id="Graphic 22" ns10:spid="_x0000_s1034" style="position:absolute;left:24570;top:126;width:127;height:1848;visibility:visible;mso-wrap-style:square;v-text-anchor:top" coordsize="12700,184785" ns10:gfxdata="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" path="m12191,l,,,184404r12191,l12191,xe" fillcolor="black" stroked="f">
+                      <v:shape id="Graphic 22" o:spid="_x0000_s1034" style="position:absolute;left:24570;top:126;width:127;height:1848;visibility:visible;mso-wrap-style:square;v-text-anchor:top" coordsize="12700,184785" o:gfxdata="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" path="m12191,l,,,184404r12191,l12191,xe" fillcolor="black" stroked="f">
                         <v:path arrowok="t"/>
                       </v:shape>
                     </v:group>
@@ -4962,138 +4962,138 @@
               <w:rPr>
                 <w:sz w:val="12"/>
               </w:rPr>
-              <w:t>* Exempted for E-way Bill vide Notf. No. 03/2018 Central Tax clause 14(e)</w:t>
+              <w:t>*</w:t>
             </w:r>
             <w:r>
               <w:rPr>
                 <w:spacing w:val="-5"/>
                 <w:sz w:val="12"/>
               </w:rPr>
-              <w:t xml:space="preserve"/>
+              <w:t xml:space="preserve"> </w:t>
             </w:r>
             <w:r>
               <w:rPr>
                 <w:sz w:val="12"/>
               </w:rPr>
-              <w:t/>
+              <w:t>GST</w:t>
             </w:r>
             <w:r>
               <w:rPr>
                 <w:spacing w:val="-5"/>
                 <w:sz w:val="12"/>
               </w:rPr>
-              <w:t xml:space="preserve"/>
+              <w:t xml:space="preserve"> </w:t>
             </w:r>
             <w:r>
               <w:rPr>
                 <w:sz w:val="12"/>
               </w:rPr>
-              <w:t/>
+              <w:t>under</w:t>
             </w:r>
             <w:r>
               <w:rPr>
                 <w:spacing w:val="-5"/>
                 <w:sz w:val="12"/>
               </w:rPr>
-              <w:t xml:space="preserve"/>
+              <w:t xml:space="preserve"> </w:t>
             </w:r>
             <w:r>
               <w:rPr>
                 <w:sz w:val="12"/>
               </w:rPr>
-              <w:t/>
+              <w:t>rcm</w:t>
             </w:r>
             <w:r>
               <w:rPr>
                 <w:spacing w:val="-4"/>
                 <w:sz w:val="12"/>
               </w:rPr>
-              <w:t xml:space="preserve"/>
+              <w:t xml:space="preserve"> </w:t>
             </w:r>
             <w:r>
               <w:rPr>
                 <w:sz w:val="12"/>
               </w:rPr>
-              <w:t/>
+              <w:t>is</w:t>
             </w:r>
             <w:r>
               <w:rPr>
                 <w:spacing w:val="-3"/>
                 <w:sz w:val="12"/>
               </w:rPr>
-              <w:t xml:space="preserve"/>
+              <w:t xml:space="preserve"> </w:t>
             </w:r>
             <w:r>
               <w:rPr>
                 <w:sz w:val="12"/>
               </w:rPr>
-              <w:t/>
+              <w:t>not</w:t>
             </w:r>
             <w:r>
               <w:rPr>
                 <w:spacing w:val="-4"/>
                 <w:sz w:val="12"/>
               </w:rPr>
-              <w:t xml:space="preserve"/>
+              <w:t xml:space="preserve"> </w:t>
             </w:r>
             <w:r>
               <w:rPr>
                 <w:sz w:val="12"/>
               </w:rPr>
-              <w:t/>
+              <w:t>applicable</w:t>
             </w:r>
             <w:r>
               <w:rPr>
                 <w:spacing w:val="-4"/>
                 <w:sz w:val="12"/>
               </w:rPr>
-              <w:t xml:space="preserve"/>
+              <w:t xml:space="preserve"> </w:t>
             </w:r>
             <w:r>
               <w:rPr>
                 <w:sz w:val="12"/>
               </w:rPr>
-              <w:t/>
+              <w:t>for</w:t>
             </w:r>
             <w:r>
               <w:rPr>
                 <w:spacing w:val="-5"/>
                 <w:sz w:val="12"/>
               </w:rPr>
-              <w:t xml:space="preserve"/>
+              <w:t xml:space="preserve"> </w:t>
             </w:r>
             <w:r>
               <w:rPr>
                 <w:sz w:val="12"/>
               </w:rPr>
-              <w:t/>
+              <w:t>outward</w:t>
             </w:r>
             <w:r>
               <w:rPr>
                 <w:spacing w:val="-5"/>
                 <w:sz w:val="12"/>
               </w:rPr>
-              <w:t xml:space="preserve"/>
+              <w:t xml:space="preserve"> </w:t>
             </w:r>
             <w:r>
               <w:rPr>
                 <w:sz w:val="12"/>
               </w:rPr>
-              <w:t/>
+              <w:t>expmted</w:t>
             </w:r>
             <w:r>
               <w:rPr>
                 <w:spacing w:val="-5"/>
                 <w:sz w:val="12"/>
               </w:rPr>
-              <w:t xml:space="preserve"/>
+              <w:t xml:space="preserve"> </w:t>
             </w:r>
             <w:r>
               <w:rPr>
                 <w:spacing w:val="-2"/>
                 <w:sz w:val="12"/>
               </w:rPr>
-              <w:t/>
+              <w:t>supply</w:t>
             </w:r>
           </w:p>
           <w:p>
@@ -5411,7 +5411,7 @@
         <mc:AlternateContent>
           <mc:Choice Requires="wps">
             <w:drawing>
-              <wp:anchor distT="0" distB="0" distL="0" distR="0" simplePos="0" relativeHeight="15730176" behindDoc="0" locked="0" layoutInCell="1" allowOverlap="1" ns4:anchorId="2BADA328" ns4:editId="3F590329">
+              <wp:anchor distT="0" distB="0" distL="0" distR="0" simplePos="0" relativeHeight="15730176" behindDoc="0" locked="0" layoutInCell="1" allowOverlap="1" wp14:anchorId="2BADA328" wp14:editId="3F590329">
                 <wp:simplePos x="0" y="0"/>
                 <wp:positionH relativeFrom="page">
                   <wp:posOffset>3155188</wp:posOffset>
@@ -5424,15 +5424,15 @@
                 <wp:wrapNone/>
                 <wp:docPr id="23" name="Textbox 23"/>
                 <wp:cNvGraphicFramePr>
-                  <a:graphicFrameLocks/>
+                  <a:graphicFrameLocks xmlns:a="http://schemas.openxmlformats.org/drawingml/2006/main"/>
                 </wp:cNvGraphicFramePr>
-                <a:graphic>
+                <a:graphic xmlns:a="http://schemas.openxmlformats.org/drawingml/2006/main">
                   <a:graphicData uri="http://schemas.microsoft.com/office/word/2010/wordprocessingShape">
-                    <ns11:wsp>
-                      <ns11:cNvSpPr txBox="1">
+                    <wps:wsp>
+                      <wps:cNvSpPr txBox="1">
                         <a:spLocks/>
-                      </ns11:cNvSpPr>
-                      <ns11:spPr>
+                      </wps:cNvSpPr>
+                      <wps:spPr>
                         <a:xfrm>
                           <a:off x="0" y="0"/>
                           <a:ext cx="3734435" cy="759460"/>
@@ -5440,8 +5440,8 @@
                         <a:prstGeom prst="rect">
                           <a:avLst/>
                         </a:prstGeom>
-                      </ns11:spPr>
-                      <ns11:txbx>
+                      </wps:spPr>
+                      <wps:txbx>
                         <w:txbxContent>
                           <w:tbl>
                             <w:tblPr>
@@ -5536,11 +5536,11 @@
                           </w:tbl>
                           <w:p/>
                         </w:txbxContent>
-                      </ns11:txbx>
-                      <ns11:bodyPr wrap="square" lIns="0" tIns="0" rIns="0" bIns="0" rtlCol="0">
+                      </wps:txbx>
+                      <wps:bodyPr wrap="square" lIns="0" tIns="0" rIns="0" bIns="0" rtlCol="0">
                         <a:noAutofit/>
-                      </ns11:bodyPr>
-                    </ns11:wsp>
+                      </wps:bodyPr>
+                    </wps:wsp>
                   </a:graphicData>
                 </a:graphic>
               </wp:anchor>
@@ -5548,11 +5548,11 @@
           </mc:Choice>
           <mc:Fallback>
             <w:pict>
-              <v:shapetype w14:anchorId="2BADA328" id="_x0000_t202" coordsize="21600,21600" ns10:spt="202" path="m,l,21600r21600,l21600,xe">
+              <v:shapetype w14:anchorId="2BADA328" id="_x0000_t202" coordsize="21600,21600" o:spt="202" path="m,l,21600r21600,l21600,xe">
                 <v:stroke joinstyle="miter"/>
-                <v:path gradientshapeok="t" ns10:connecttype="rect"/>
+                <v:path gradientshapeok="t" o:connecttype="rect"/>
               </v:shapetype>
-              <v:shape id="Textbox 23" ns10:spid="_x0000_s1026" type="#_x0000_t202" style="position:absolute;margin-left:248.45pt;margin-top:48.35pt;width:294.05pt;height:59.8pt;z-index:15730176;visibility:visible;mso-wrap-style:square;mso-wrap-distance-left:0;mso-wrap-distance-top:0;mso-wrap-distance-right:0;mso-wrap-distance-bottom:0;mso-position-horizontal:absolute;mso-position-horizontal-relative:page;mso-position-vertical:absolute;mso-position-vertical-relative:page;v-text-anchor:top" ns10:gfxdata="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" filled="f" stroked="f">
+              <v:shape id="Textbox 23" o:spid="_x0000_s1026" type="#_x0000_t202" style="position:absolute;margin-left:248.45pt;margin-top:48.35pt;width:294.05pt;height:59.8pt;z-index:15730176;visibility:visible;mso-wrap-style:square;mso-wrap-distance-left:0;mso-wrap-distance-top:0;mso-wrap-distance-right:0;mso-wrap-distance-bottom:0;mso-position-horizontal:absolute;mso-position-horizontal-relative:page;mso-position-vertical:absolute;mso-position-vertical-relative:page;v-text-anchor:top" o:gfxdata="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" filled="f" stroked="f">
                 <v:textbox inset="0,0,0,0">
                   <w:txbxContent>
                     <w:tbl>
@@ -5649,7 +5649,7 @@
                     <w:p/>
                   </w:txbxContent>
                 </v:textbox>
-                <ns12:wrap anchorx="page" anchory="page"/>
+                <w10:wrap anchorx="page" anchory="page"/>
               </v:shape>
             </w:pict>
           </mc:Fallback>

</xml_diff>

<commit_message>
Generate DOCX and PDF simultaneously, align PDF layout with Word template, and support end-to-end phone invoice generation on GitHub Pages
</commit_message>
<xml_diff>
--- a/11048.docx
+++ b/11048.docx
@@ -204,7 +204,7 @@
                 <w:b/>
                 <w:sz w:val="28"/>
               </w:rPr>
-              <w:t>SR</w:t>
+              <w:t>SR TRANSPORT</w:t>
             </w:r>
             <w:r>
               <w:rPr>
@@ -221,7 +221,7 @@
                 <w:b/>
                 <w:sz w:val="28"/>
               </w:rPr>
-              <w:t>Trans</w:t>
+              <w:t/>
             </w:r>
             <w:r>
               <w:rPr>
@@ -238,7 +238,7 @@
                 <w:b/>
                 <w:sz w:val="28"/>
               </w:rPr>
-              <w:t>and</w:t>
+              <w:t/>
             </w:r>
             <w:r>
               <w:rPr>
@@ -255,7 +255,7 @@
                 <w:b/>
                 <w:sz w:val="28"/>
               </w:rPr>
-              <w:t>Trade</w:t>
+              <w:t/>
             </w:r>
             <w:r>
               <w:rPr>
@@ -272,7 +272,7 @@
                 <w:b/>
                 <w:sz w:val="28"/>
               </w:rPr>
-              <w:t>India</w:t>
+              <w:t/>
             </w:r>
             <w:r>
               <w:rPr>
@@ -289,7 +289,7 @@
                 <w:b/>
                 <w:sz w:val="28"/>
               </w:rPr>
-              <w:t>Private</w:t>
+              <w:t/>
             </w:r>
             <w:r>
               <w:rPr>
@@ -307,7 +307,7 @@
                 <w:spacing w:val="-2"/>
                 <w:sz w:val="28"/>
               </w:rPr>
-              <w:t>Limited</w:t>
+              <w:t/>
             </w:r>
           </w:p>
           <w:p>
@@ -323,7 +323,7 @@
               <w:rPr>
                 <w:sz w:val="20"/>
               </w:rPr>
-              <w:t>1-2-597/36</w:t>
+              <w:t>Plot No. 341, Sai Bhagavan Colony, Beeramguda, R.C. Puram, Hyderabad - 502032</w:t>
             </w:r>
             <w:r>
               <w:rPr>
@@ -336,7 +336,7 @@
               <w:rPr>
                 <w:sz w:val="20"/>
               </w:rPr>
-              <w:t>to</w:t>
+              <w:t/>
             </w:r>
             <w:r>
               <w:rPr>
@@ -349,7 +349,7 @@
               <w:rPr>
                 <w:sz w:val="20"/>
               </w:rPr>
-              <w:t>41,</w:t>
+              <w:t/>
             </w:r>
             <w:r>
               <w:rPr>
@@ -362,7 +362,7 @@
               <w:rPr>
                 <w:sz w:val="20"/>
               </w:rPr>
-              <w:t>SVSS</w:t>
+              <w:t/>
             </w:r>
             <w:r>
               <w:rPr>
@@ -375,7 +375,7 @@
               <w:rPr>
                 <w:sz w:val="20"/>
               </w:rPr>
-              <w:t>SANKALP</w:t>
+              <w:t/>
             </w:r>
             <w:r>
               <w:rPr>
@@ -388,7 +388,7 @@
               <w:rPr>
                 <w:sz w:val="20"/>
               </w:rPr>
-              <w:t>Apts,</w:t>
+              <w:t/>
             </w:r>
             <w:r>
               <w:rPr>
@@ -401,7 +401,7 @@
               <w:rPr>
                 <w:sz w:val="20"/>
               </w:rPr>
-              <w:t>C-303 LOWER TANK BUND, HYDERABAD-500 080</w:t>
+              <w:t/>
             </w:r>
           </w:p>
           <w:p>
@@ -450,7 +450,7 @@
               <w:rPr>
                 <w:sz w:val="20"/>
               </w:rPr>
-              <w:t>+91</w:t>
+              <w:t/>
             </w:r>
             <w:r>
               <w:rPr>
@@ -464,7 +464,7 @@
                 <w:spacing w:val="-2"/>
                 <w:sz w:val="20"/>
               </w:rPr>
-              <w:t>9704527762</w:t>
+              <w:t>9704527762 / 9010578128 / 9966818478</w:t>
             </w:r>
             <w:r>
               <w:rPr>
@@ -3494,7 +3494,7 @@
                 <w:b/>
                 <w:sz w:val="18"/>
               </w:rPr>
-              <w:t>SR</w:t>
+              <w:t>SR TRANSPORT</w:t>
             </w:r>
             <w:r>
               <w:rPr>
@@ -3509,7 +3509,7 @@
                 <w:b/>
                 <w:sz w:val="18"/>
               </w:rPr>
-              <w:t>Trans</w:t>
+              <w:t/>
             </w:r>
             <w:r>
               <w:rPr>
@@ -3524,7 +3524,7 @@
                 <w:b/>
                 <w:sz w:val="18"/>
               </w:rPr>
-              <w:t>and</w:t>
+              <w:t/>
             </w:r>
             <w:r>
               <w:rPr>
@@ -3539,7 +3539,7 @@
                 <w:b/>
                 <w:sz w:val="18"/>
               </w:rPr>
-              <w:t>Trade</w:t>
+              <w:t/>
             </w:r>
             <w:r>
               <w:rPr>
@@ -3554,7 +3554,7 @@
                 <w:b/>
                 <w:sz w:val="18"/>
               </w:rPr>
-              <w:t>India</w:t>
+              <w:t/>
             </w:r>
             <w:r>
               <w:rPr>
@@ -3569,7 +3569,7 @@
                 <w:b/>
                 <w:sz w:val="18"/>
               </w:rPr>
-              <w:t>Private</w:t>
+              <w:t/>
             </w:r>
             <w:r>
               <w:rPr>
@@ -3577,7 +3577,7 @@
                 <w:spacing w:val="-2"/>
                 <w:sz w:val="18"/>
               </w:rPr>
-              <w:t xml:space="preserve"> Limited</w:t>
+              <w:t xml:space="preserve"/>
             </w:r>
           </w:p>
           <w:p>
@@ -4220,7 +4220,7 @@
                 <w:b/>
                 <w:sz w:val="16"/>
               </w:rPr>
-              <w:t>GSTIN:</w:t>
+              <w:t>Reg No:</w:t>
             </w:r>
             <w:r>
               <w:rPr>
@@ -4228,7 +4228,7 @@
                 <w:spacing w:val="-2"/>
                 <w:sz w:val="16"/>
               </w:rPr>
-              <w:t xml:space="preserve"> 36ELKPK3812H1ZP</w:t>
+              <w:t xml:space="preserve"> SEA/SAN/ALO/PC/0607538/2023</w:t>
             </w:r>
             <w:r>
               <w:rPr>
@@ -4347,7 +4347,7 @@
                 <w:sz w:val="18"/>
               </w:rPr>
               <w:tab/>
-              <w:t>Sarojini</w:t>
+              <w:t>Chandanagar</w:t>
             </w:r>
             <w:r>
               <w:rPr>
@@ -4360,14 +4360,14 @@
               <w:rPr>
                 <w:sz w:val="18"/>
               </w:rPr>
-              <w:t>Devi</w:t>
+              <w:t/>
             </w:r>
             <w:r>
               <w:rPr>
                 <w:spacing w:val="-4"/>
                 <w:sz w:val="18"/>
               </w:rPr>
-              <w:t xml:space="preserve"> Road</w:t>
+              <w:t xml:space="preserve"/>
             </w:r>
             <w:r>
               <w:rPr>
@@ -4418,7 +4418,7 @@
                 <w:b/>
                 <w:sz w:val="16"/>
               </w:rPr>
-              <w:t>CIN:</w:t>
+              <w:t>Udyam:</w:t>
             </w:r>
             <w:r>
               <w:rPr>
@@ -4492,7 +4492,7 @@
                 <w:b/>
                 <w:sz w:val="16"/>
               </w:rPr>
-              <w:t>Udyam</w:t>
+              <w:t>* Note:</w:t>
             </w:r>
             <w:r>
               <w:rPr>
@@ -4507,7 +4507,7 @@
                 <w:b/>
                 <w:sz w:val="16"/>
               </w:rPr>
-              <w:t>Certificate:</w:t>
+              <w:t>GST to be paid by Service Recipient</w:t>
             </w:r>
             <w:r>
               <w:rPr>
@@ -4522,7 +4522,7 @@
                 <w:b/>
                 <w:sz w:val="16"/>
               </w:rPr>
-              <w:t>UDYAM-TS-02-</w:t>
+              <w:t> under RCM</w:t>
             </w:r>
             <w:r>
               <w:rPr>
@@ -4530,7 +4530,7 @@
                 <w:spacing w:val="-2"/>
                 <w:sz w:val="16"/>
               </w:rPr>
-              <w:t>0048963</w:t>
+              <w:t/>
             </w:r>
           </w:p>
           <w:p>

</xml_diff>